<commit_message>
Added trigger scripts and works to get the process complete.
</commit_message>
<xml_diff>
--- a/01-planning/00-tender-review/01 - original/FY26-FMS-003x-ITQ GSF Cloud-Based Resource Booking System.docx
+++ b/01-planning/00-tender-review/01 - original/FY26-FMS-003x-ITQ GSF Cloud-Based Resource Booking System.docx
@@ -1247,7 +1247,29 @@
           <w:szCs w:val="20"/>
           <w:lang w:eastAsia="zh-CN"/>
         </w:rPr>
-        <w:t xml:space="preserve">The Polytechnic shall also have the right to terminate the Contract by giving 1 month's notice in writing </w:t>
+        <w:t xml:space="preserve">The Polytechnic shall also have the right to terminate the Contract by giving 1 </w:t>
+      </w:r>
+      <w:proofErr w:type="spellStart"/>
+      <w:r>
+        <w:rPr>
+          <w:rFonts w:ascii="Helv" w:hAnsi="Helv" w:cs="Helv"/>
+          <w:color w:val="000000"/>
+          <w:sz w:val="20"/>
+          <w:szCs w:val="20"/>
+          <w:lang w:eastAsia="zh-CN"/>
+        </w:rPr>
+        <w:t>month's notice</w:t>
+      </w:r>
+      <w:proofErr w:type="spellEnd"/>
+      <w:r>
+        <w:rPr>
+          <w:rFonts w:ascii="Helv" w:hAnsi="Helv" w:cs="Helv"/>
+          <w:color w:val="000000"/>
+          <w:sz w:val="20"/>
+          <w:szCs w:val="20"/>
+          <w:lang w:eastAsia="zh-CN"/>
+        </w:rPr>
+        <w:t xml:space="preserve"> in writing </w:t>
       </w:r>
       <w:r>
         <w:rPr>
@@ -2168,11 +2190,11 @@
       <w:tblGrid>
         <w:gridCol w:w="571"/>
         <w:gridCol w:w="1760"/>
-        <w:gridCol w:w="3766"/>
-        <w:gridCol w:w="819"/>
+        <w:gridCol w:w="3560"/>
+        <w:gridCol w:w="817"/>
         <w:gridCol w:w="683"/>
         <w:gridCol w:w="587"/>
-        <w:gridCol w:w="1315"/>
+        <w:gridCol w:w="1523"/>
       </w:tblGrid>
       <w:tr>
         <w:trPr>
@@ -2244,7 +2266,7 @@
         </w:trPr>
         <w:tc>
           <w:tcPr>
-            <w:tcW w:w="6916" w:type="dxa"/>
+            <w:tcW w:w="6820" w:type="dxa"/>
             <w:gridSpan w:val="4"/>
             <w:tcBorders>
               <w:bottom w:val="single" w:sz="4" w:space="0" w:color="666699"/>
@@ -2268,7 +2290,7 @@
         </w:tc>
         <w:tc>
           <w:tcPr>
-            <w:tcW w:w="2585" w:type="dxa"/>
+            <w:tcW w:w="2681" w:type="dxa"/>
             <w:gridSpan w:val="3"/>
             <w:tcBorders>
               <w:left w:val="single" w:sz="12" w:space="0" w:color="666699"/>
@@ -2309,7 +2331,7 @@
         </w:trPr>
         <w:tc>
           <w:tcPr>
-            <w:tcW w:w="6097" w:type="dxa"/>
+            <w:tcW w:w="6002" w:type="dxa"/>
             <w:gridSpan w:val="3"/>
             <w:vMerge w:val="restart"/>
             <w:tcBorders>
@@ -2344,7 +2366,7 @@
         </w:tc>
         <w:tc>
           <w:tcPr>
-            <w:tcW w:w="819" w:type="dxa"/>
+            <w:tcW w:w="818" w:type="dxa"/>
             <w:tcBorders>
               <w:right w:val="single" w:sz="12" w:space="0" w:color="666699"/>
             </w:tcBorders>
@@ -2418,7 +2440,7 @@
         </w:tc>
         <w:tc>
           <w:tcPr>
-            <w:tcW w:w="1315" w:type="dxa"/>
+            <w:tcW w:w="1411" w:type="dxa"/>
             <w:vMerge w:val="restart"/>
             <w:shd w:val="clear" w:color="auto" w:fill="4F81BD"/>
           </w:tcPr>
@@ -2457,7 +2479,7 @@
         </w:trPr>
         <w:tc>
           <w:tcPr>
-            <w:tcW w:w="6097" w:type="dxa"/>
+            <w:tcW w:w="6002" w:type="dxa"/>
             <w:gridSpan w:val="3"/>
             <w:vMerge/>
             <w:tcBorders>
@@ -2477,7 +2499,7 @@
         </w:tc>
         <w:tc>
           <w:tcPr>
-            <w:tcW w:w="819" w:type="dxa"/>
+            <w:tcW w:w="818" w:type="dxa"/>
             <w:tcBorders>
               <w:right w:val="single" w:sz="12" w:space="0" w:color="666699"/>
             </w:tcBorders>
@@ -2573,7 +2595,7 @@
         </w:tc>
         <w:tc>
           <w:tcPr>
-            <w:tcW w:w="1315" w:type="dxa"/>
+            <w:tcW w:w="1411" w:type="dxa"/>
             <w:vMerge/>
             <w:shd w:val="clear" w:color="auto" w:fill="666699"/>
           </w:tcPr>
@@ -2617,7 +2639,7 @@
         </w:tc>
         <w:tc>
           <w:tcPr>
-            <w:tcW w:w="5526" w:type="dxa"/>
+            <w:tcW w:w="5431" w:type="dxa"/>
             <w:gridSpan w:val="2"/>
             <w:tcBorders>
               <w:right w:val="single" w:sz="12" w:space="0" w:color="666699"/>
@@ -2662,7 +2684,7 @@
         </w:tc>
         <w:tc>
           <w:tcPr>
-            <w:tcW w:w="819" w:type="dxa"/>
+            <w:tcW w:w="818" w:type="dxa"/>
             <w:tcBorders>
               <w:right w:val="single" w:sz="12" w:space="0" w:color="666699"/>
             </w:tcBorders>
@@ -2713,7 +2735,7 @@
         </w:tc>
         <w:tc>
           <w:tcPr>
-            <w:tcW w:w="1315" w:type="dxa"/>
+            <w:tcW w:w="1411" w:type="dxa"/>
           </w:tcPr>
           <w:p>
             <w:pPr>
@@ -2755,7 +2777,7 @@
         </w:tc>
         <w:tc>
           <w:tcPr>
-            <w:tcW w:w="5526" w:type="dxa"/>
+            <w:tcW w:w="5431" w:type="dxa"/>
             <w:gridSpan w:val="2"/>
             <w:tcBorders>
               <w:right w:val="single" w:sz="12" w:space="0" w:color="666699"/>
@@ -2891,7 +2913,7 @@
         </w:tc>
         <w:tc>
           <w:tcPr>
-            <w:tcW w:w="819" w:type="dxa"/>
+            <w:tcW w:w="818" w:type="dxa"/>
             <w:tcBorders>
               <w:right w:val="single" w:sz="12" w:space="0" w:color="666699"/>
             </w:tcBorders>
@@ -2931,6 +2953,14 @@
                 <w:szCs w:val="20"/>
               </w:rPr>
             </w:pPr>
+            <w:r>
+              <w:rPr>
+                <w:rFonts w:asciiTheme="minorHAnsi" w:hAnsiTheme="minorHAnsi" w:cstheme="minorHAnsi"/>
+                <w:sz w:val="20"/>
+                <w:szCs w:val="20"/>
+              </w:rPr>
+              <w:t>Y</w:t>
+            </w:r>
           </w:p>
         </w:tc>
         <w:tc>
@@ -2950,7 +2980,7 @@
         </w:tc>
         <w:tc>
           <w:tcPr>
-            <w:tcW w:w="1315" w:type="dxa"/>
+            <w:tcW w:w="1411" w:type="dxa"/>
           </w:tcPr>
           <w:p>
             <w:pPr>
@@ -2993,7 +3023,7 @@
         </w:tc>
         <w:tc>
           <w:tcPr>
-            <w:tcW w:w="5526" w:type="dxa"/>
+            <w:tcW w:w="5431" w:type="dxa"/>
             <w:gridSpan w:val="2"/>
             <w:tcBorders>
               <w:right w:val="single" w:sz="12" w:space="0" w:color="666699"/>
@@ -3203,7 +3233,7 @@
         </w:tc>
         <w:tc>
           <w:tcPr>
-            <w:tcW w:w="819" w:type="dxa"/>
+            <w:tcW w:w="818" w:type="dxa"/>
             <w:tcBorders>
               <w:right w:val="single" w:sz="12" w:space="0" w:color="666699"/>
             </w:tcBorders>
@@ -3242,6 +3272,14 @@
                 <w:szCs w:val="20"/>
               </w:rPr>
             </w:pPr>
+            <w:r>
+              <w:rPr>
+                <w:rFonts w:asciiTheme="minorHAnsi" w:hAnsiTheme="minorHAnsi" w:cstheme="minorHAnsi"/>
+                <w:sz w:val="20"/>
+                <w:szCs w:val="20"/>
+              </w:rPr>
+              <w:t>Y</w:t>
+            </w:r>
           </w:p>
         </w:tc>
         <w:tc>
@@ -3261,7 +3299,7 @@
         </w:tc>
         <w:tc>
           <w:tcPr>
-            <w:tcW w:w="1315" w:type="dxa"/>
+            <w:tcW w:w="1411" w:type="dxa"/>
           </w:tcPr>
           <w:p>
             <w:pPr>
@@ -3311,7 +3349,7 @@
         </w:tc>
         <w:tc>
           <w:tcPr>
-            <w:tcW w:w="5526" w:type="dxa"/>
+            <w:tcW w:w="5431" w:type="dxa"/>
             <w:gridSpan w:val="2"/>
             <w:tcBorders>
               <w:right w:val="single" w:sz="12" w:space="0" w:color="666699"/>
@@ -3380,7 +3418,7 @@
         </w:tc>
         <w:tc>
           <w:tcPr>
-            <w:tcW w:w="819" w:type="dxa"/>
+            <w:tcW w:w="818" w:type="dxa"/>
             <w:tcBorders>
               <w:right w:val="single" w:sz="12" w:space="0" w:color="666699"/>
             </w:tcBorders>
@@ -3420,6 +3458,14 @@
                 <w:szCs w:val="20"/>
               </w:rPr>
             </w:pPr>
+            <w:r>
+              <w:rPr>
+                <w:rFonts w:asciiTheme="minorHAnsi" w:hAnsiTheme="minorHAnsi" w:cstheme="minorHAnsi"/>
+                <w:sz w:val="20"/>
+                <w:szCs w:val="20"/>
+              </w:rPr>
+              <w:t>Y</w:t>
+            </w:r>
           </w:p>
         </w:tc>
         <w:tc>
@@ -3439,7 +3485,7 @@
         </w:tc>
         <w:tc>
           <w:tcPr>
-            <w:tcW w:w="1315" w:type="dxa"/>
+            <w:tcW w:w="1411" w:type="dxa"/>
           </w:tcPr>
           <w:p>
             <w:pPr>
@@ -3481,7 +3527,7 @@
         </w:tc>
         <w:tc>
           <w:tcPr>
-            <w:tcW w:w="5526" w:type="dxa"/>
+            <w:tcW w:w="5431" w:type="dxa"/>
             <w:gridSpan w:val="2"/>
             <w:tcBorders>
               <w:right w:val="single" w:sz="12" w:space="0" w:color="666699"/>
@@ -3507,7 +3553,7 @@
         </w:tc>
         <w:tc>
           <w:tcPr>
-            <w:tcW w:w="819" w:type="dxa"/>
+            <w:tcW w:w="818" w:type="dxa"/>
             <w:tcBorders>
               <w:right w:val="single" w:sz="12" w:space="0" w:color="666699"/>
             </w:tcBorders>
@@ -3558,7 +3604,7 @@
         </w:tc>
         <w:tc>
           <w:tcPr>
-            <w:tcW w:w="1315" w:type="dxa"/>
+            <w:tcW w:w="1411" w:type="dxa"/>
           </w:tcPr>
           <w:p>
             <w:pPr>
@@ -3601,7 +3647,7 @@
         </w:tc>
         <w:tc>
           <w:tcPr>
-            <w:tcW w:w="5526" w:type="dxa"/>
+            <w:tcW w:w="5431" w:type="dxa"/>
             <w:gridSpan w:val="2"/>
             <w:tcBorders>
               <w:right w:val="single" w:sz="12" w:space="0" w:color="666699"/>
@@ -4289,7 +4335,7 @@
         </w:tc>
         <w:tc>
           <w:tcPr>
-            <w:tcW w:w="819" w:type="dxa"/>
+            <w:tcW w:w="818" w:type="dxa"/>
             <w:tcBorders>
               <w:right w:val="single" w:sz="12" w:space="0" w:color="666699"/>
             </w:tcBorders>
@@ -4329,6 +4375,14 @@
                 <w:szCs w:val="20"/>
               </w:rPr>
             </w:pPr>
+            <w:r>
+              <w:rPr>
+                <w:rFonts w:asciiTheme="minorHAnsi" w:hAnsiTheme="minorHAnsi" w:cstheme="minorHAnsi"/>
+                <w:sz w:val="20"/>
+                <w:szCs w:val="20"/>
+              </w:rPr>
+              <w:t>Y</w:t>
+            </w:r>
           </w:p>
         </w:tc>
         <w:tc>
@@ -4348,7 +4402,7 @@
         </w:tc>
         <w:tc>
           <w:tcPr>
-            <w:tcW w:w="1315" w:type="dxa"/>
+            <w:tcW w:w="1411" w:type="dxa"/>
           </w:tcPr>
           <w:p>
             <w:pPr>
@@ -4391,7 +4445,7 @@
         </w:tc>
         <w:tc>
           <w:tcPr>
-            <w:tcW w:w="5526" w:type="dxa"/>
+            <w:tcW w:w="5431" w:type="dxa"/>
             <w:gridSpan w:val="2"/>
             <w:tcBorders>
               <w:right w:val="single" w:sz="12" w:space="0" w:color="666699"/>
@@ -4950,7 +5004,7 @@
         </w:tc>
         <w:tc>
           <w:tcPr>
-            <w:tcW w:w="819" w:type="dxa"/>
+            <w:tcW w:w="818" w:type="dxa"/>
             <w:tcBorders>
               <w:right w:val="single" w:sz="12" w:space="0" w:color="666699"/>
             </w:tcBorders>
@@ -4990,6 +5044,14 @@
                 <w:szCs w:val="20"/>
               </w:rPr>
             </w:pPr>
+            <w:r>
+              <w:rPr>
+                <w:rFonts w:asciiTheme="minorHAnsi" w:hAnsiTheme="minorHAnsi" w:cstheme="minorHAnsi"/>
+                <w:sz w:val="20"/>
+                <w:szCs w:val="20"/>
+              </w:rPr>
+              <w:t>Y</w:t>
+            </w:r>
           </w:p>
         </w:tc>
         <w:tc>
@@ -5009,7 +5071,7 @@
         </w:tc>
         <w:tc>
           <w:tcPr>
-            <w:tcW w:w="1315" w:type="dxa"/>
+            <w:tcW w:w="1411" w:type="dxa"/>
           </w:tcPr>
           <w:p>
             <w:pPr>
@@ -5052,7 +5114,7 @@
         </w:tc>
         <w:tc>
           <w:tcPr>
-            <w:tcW w:w="5526" w:type="dxa"/>
+            <w:tcW w:w="5431" w:type="dxa"/>
             <w:gridSpan w:val="2"/>
             <w:tcBorders>
               <w:right w:val="single" w:sz="12" w:space="0" w:color="666699"/>
@@ -5177,7 +5239,7 @@
         </w:tc>
         <w:tc>
           <w:tcPr>
-            <w:tcW w:w="819" w:type="dxa"/>
+            <w:tcW w:w="818" w:type="dxa"/>
             <w:tcBorders>
               <w:right w:val="single" w:sz="12" w:space="0" w:color="666699"/>
             </w:tcBorders>
@@ -5217,6 +5279,14 @@
                 <w:szCs w:val="20"/>
               </w:rPr>
             </w:pPr>
+            <w:r>
+              <w:rPr>
+                <w:rFonts w:asciiTheme="minorHAnsi" w:hAnsiTheme="minorHAnsi" w:cstheme="minorHAnsi"/>
+                <w:sz w:val="20"/>
+                <w:szCs w:val="20"/>
+              </w:rPr>
+              <w:t>Y</w:t>
+            </w:r>
           </w:p>
         </w:tc>
         <w:tc>
@@ -5236,7 +5306,7 @@
         </w:tc>
         <w:tc>
           <w:tcPr>
-            <w:tcW w:w="1315" w:type="dxa"/>
+            <w:tcW w:w="1411" w:type="dxa"/>
           </w:tcPr>
           <w:p>
             <w:pPr>
@@ -5278,7 +5348,7 @@
         </w:tc>
         <w:tc>
           <w:tcPr>
-            <w:tcW w:w="5526" w:type="dxa"/>
+            <w:tcW w:w="5431" w:type="dxa"/>
             <w:gridSpan w:val="2"/>
             <w:tcBorders>
               <w:right w:val="single" w:sz="12" w:space="0" w:color="666699"/>
@@ -5598,7 +5668,7 @@
         </w:tc>
         <w:tc>
           <w:tcPr>
-            <w:tcW w:w="819" w:type="dxa"/>
+            <w:tcW w:w="818" w:type="dxa"/>
             <w:tcBorders>
               <w:right w:val="single" w:sz="12" w:space="0" w:color="666699"/>
             </w:tcBorders>
@@ -5638,6 +5708,14 @@
                 <w:szCs w:val="20"/>
               </w:rPr>
             </w:pPr>
+            <w:r>
+              <w:rPr>
+                <w:rFonts w:asciiTheme="minorHAnsi" w:hAnsiTheme="minorHAnsi" w:cstheme="minorHAnsi"/>
+                <w:sz w:val="20"/>
+                <w:szCs w:val="20"/>
+              </w:rPr>
+              <w:t>Y</w:t>
+            </w:r>
           </w:p>
         </w:tc>
         <w:tc>
@@ -5657,7 +5735,7 @@
         </w:tc>
         <w:tc>
           <w:tcPr>
-            <w:tcW w:w="1315" w:type="dxa"/>
+            <w:tcW w:w="1411" w:type="dxa"/>
           </w:tcPr>
           <w:p>
             <w:pPr>
@@ -5693,13 +5771,14 @@
                 <w:sz w:val="20"/>
                 <w:szCs w:val="20"/>
               </w:rPr>
+              <w:lastRenderedPageBreak/>
               <w:t>4</w:t>
             </w:r>
           </w:p>
         </w:tc>
         <w:tc>
           <w:tcPr>
-            <w:tcW w:w="5526" w:type="dxa"/>
+            <w:tcW w:w="5431" w:type="dxa"/>
             <w:gridSpan w:val="2"/>
             <w:tcBorders>
               <w:right w:val="single" w:sz="12" w:space="0" w:color="666699"/>
@@ -5735,7 +5814,7 @@
         </w:tc>
         <w:tc>
           <w:tcPr>
-            <w:tcW w:w="819" w:type="dxa"/>
+            <w:tcW w:w="818" w:type="dxa"/>
             <w:tcBorders>
               <w:right w:val="single" w:sz="12" w:space="0" w:color="666699"/>
             </w:tcBorders>
@@ -5786,7 +5865,7 @@
         </w:tc>
         <w:tc>
           <w:tcPr>
-            <w:tcW w:w="1315" w:type="dxa"/>
+            <w:tcW w:w="1411" w:type="dxa"/>
           </w:tcPr>
           <w:p>
             <w:pPr>
@@ -5822,14 +5901,13 @@
                 <w:sz w:val="20"/>
                 <w:szCs w:val="20"/>
               </w:rPr>
-              <w:lastRenderedPageBreak/>
               <w:t>4.1</w:t>
             </w:r>
           </w:p>
         </w:tc>
         <w:tc>
           <w:tcPr>
-            <w:tcW w:w="5526" w:type="dxa"/>
+            <w:tcW w:w="5431" w:type="dxa"/>
             <w:gridSpan w:val="2"/>
             <w:tcBorders>
               <w:right w:val="single" w:sz="12" w:space="0" w:color="666699"/>
@@ -5979,7 +6057,7 @@
         </w:tc>
         <w:tc>
           <w:tcPr>
-            <w:tcW w:w="819" w:type="dxa"/>
+            <w:tcW w:w="818" w:type="dxa"/>
             <w:tcBorders>
               <w:right w:val="single" w:sz="12" w:space="0" w:color="666699"/>
             </w:tcBorders>
@@ -6019,6 +6097,14 @@
                 <w:szCs w:val="20"/>
               </w:rPr>
             </w:pPr>
+            <w:r>
+              <w:rPr>
+                <w:rFonts w:asciiTheme="minorHAnsi" w:hAnsiTheme="minorHAnsi" w:cstheme="minorHAnsi"/>
+                <w:sz w:val="20"/>
+                <w:szCs w:val="20"/>
+              </w:rPr>
+              <w:t>Y</w:t>
+            </w:r>
           </w:p>
         </w:tc>
         <w:tc>
@@ -6038,7 +6124,7 @@
         </w:tc>
         <w:tc>
           <w:tcPr>
-            <w:tcW w:w="1315" w:type="dxa"/>
+            <w:tcW w:w="1411" w:type="dxa"/>
           </w:tcPr>
           <w:p>
             <w:pPr>
@@ -6080,7 +6166,7 @@
         </w:tc>
         <w:tc>
           <w:tcPr>
-            <w:tcW w:w="5526" w:type="dxa"/>
+            <w:tcW w:w="5431" w:type="dxa"/>
             <w:gridSpan w:val="2"/>
             <w:tcBorders>
               <w:right w:val="single" w:sz="12" w:space="0" w:color="666699"/>
@@ -6302,7 +6388,7 @@
         </w:tc>
         <w:tc>
           <w:tcPr>
-            <w:tcW w:w="819" w:type="dxa"/>
+            <w:tcW w:w="818" w:type="dxa"/>
             <w:tcBorders>
               <w:right w:val="single" w:sz="12" w:space="0" w:color="666699"/>
             </w:tcBorders>
@@ -6342,6 +6428,14 @@
                 <w:szCs w:val="20"/>
               </w:rPr>
             </w:pPr>
+            <w:r>
+              <w:rPr>
+                <w:rFonts w:asciiTheme="minorHAnsi" w:hAnsiTheme="minorHAnsi" w:cstheme="minorHAnsi"/>
+                <w:sz w:val="20"/>
+                <w:szCs w:val="20"/>
+              </w:rPr>
+              <w:t>Y</w:t>
+            </w:r>
           </w:p>
         </w:tc>
         <w:tc>
@@ -6361,7 +6455,7 @@
         </w:tc>
         <w:tc>
           <w:tcPr>
-            <w:tcW w:w="1315" w:type="dxa"/>
+            <w:tcW w:w="1411" w:type="dxa"/>
           </w:tcPr>
           <w:p>
             <w:pPr>
@@ -6403,7 +6497,7 @@
         </w:tc>
         <w:tc>
           <w:tcPr>
-            <w:tcW w:w="5526" w:type="dxa"/>
+            <w:tcW w:w="5431" w:type="dxa"/>
             <w:gridSpan w:val="2"/>
             <w:tcBorders>
               <w:right w:val="single" w:sz="12" w:space="0" w:color="666699"/>
@@ -6505,7 +6599,7 @@
         </w:tc>
         <w:tc>
           <w:tcPr>
-            <w:tcW w:w="819" w:type="dxa"/>
+            <w:tcW w:w="818" w:type="dxa"/>
             <w:tcBorders>
               <w:right w:val="single" w:sz="12" w:space="0" w:color="666699"/>
             </w:tcBorders>
@@ -6545,6 +6639,14 @@
                 <w:szCs w:val="20"/>
               </w:rPr>
             </w:pPr>
+            <w:r>
+              <w:rPr>
+                <w:rFonts w:asciiTheme="minorHAnsi" w:hAnsiTheme="minorHAnsi" w:cstheme="minorHAnsi"/>
+                <w:sz w:val="20"/>
+                <w:szCs w:val="20"/>
+              </w:rPr>
+              <w:t>Y</w:t>
+            </w:r>
           </w:p>
         </w:tc>
         <w:tc>
@@ -6564,7 +6666,7 @@
         </w:tc>
         <w:tc>
           <w:tcPr>
-            <w:tcW w:w="1315" w:type="dxa"/>
+            <w:tcW w:w="1411" w:type="dxa"/>
           </w:tcPr>
           <w:p>
             <w:pPr>
@@ -6606,7 +6708,7 @@
         </w:tc>
         <w:tc>
           <w:tcPr>
-            <w:tcW w:w="5526" w:type="dxa"/>
+            <w:tcW w:w="5431" w:type="dxa"/>
             <w:gridSpan w:val="2"/>
             <w:tcBorders>
               <w:right w:val="single" w:sz="12" w:space="0" w:color="666699"/>
@@ -6636,7 +6738,7 @@
         </w:tc>
         <w:tc>
           <w:tcPr>
-            <w:tcW w:w="819" w:type="dxa"/>
+            <w:tcW w:w="818" w:type="dxa"/>
             <w:tcBorders>
               <w:right w:val="single" w:sz="12" w:space="0" w:color="666699"/>
             </w:tcBorders>
@@ -6687,7 +6789,7 @@
         </w:tc>
         <w:tc>
           <w:tcPr>
-            <w:tcW w:w="1315" w:type="dxa"/>
+            <w:tcW w:w="1411" w:type="dxa"/>
           </w:tcPr>
           <w:p>
             <w:pPr>
@@ -6729,7 +6831,7 @@
         </w:tc>
         <w:tc>
           <w:tcPr>
-            <w:tcW w:w="5526" w:type="dxa"/>
+            <w:tcW w:w="5431" w:type="dxa"/>
             <w:gridSpan w:val="2"/>
             <w:tcBorders>
               <w:right w:val="single" w:sz="12" w:space="0" w:color="666699"/>
@@ -6880,7 +6982,7 @@
         </w:tc>
         <w:tc>
           <w:tcPr>
-            <w:tcW w:w="819" w:type="dxa"/>
+            <w:tcW w:w="818" w:type="dxa"/>
             <w:tcBorders>
               <w:right w:val="single" w:sz="12" w:space="0" w:color="666699"/>
             </w:tcBorders>
@@ -6920,6 +7022,14 @@
                 <w:szCs w:val="20"/>
               </w:rPr>
             </w:pPr>
+            <w:r>
+              <w:rPr>
+                <w:rFonts w:asciiTheme="minorHAnsi" w:hAnsiTheme="minorHAnsi" w:cstheme="minorHAnsi"/>
+                <w:sz w:val="20"/>
+                <w:szCs w:val="20"/>
+              </w:rPr>
+              <w:t>Y</w:t>
+            </w:r>
           </w:p>
         </w:tc>
         <w:tc>
@@ -6939,7 +7049,7 @@
         </w:tc>
         <w:tc>
           <w:tcPr>
-            <w:tcW w:w="1315" w:type="dxa"/>
+            <w:tcW w:w="1411" w:type="dxa"/>
           </w:tcPr>
           <w:p>
             <w:pPr>
@@ -6981,7 +7091,7 @@
         </w:tc>
         <w:tc>
           <w:tcPr>
-            <w:tcW w:w="5526" w:type="dxa"/>
+            <w:tcW w:w="5431" w:type="dxa"/>
             <w:gridSpan w:val="2"/>
             <w:tcBorders>
               <w:right w:val="single" w:sz="12" w:space="0" w:color="666699"/>
@@ -7059,7 +7169,7 @@
         </w:tc>
         <w:tc>
           <w:tcPr>
-            <w:tcW w:w="819" w:type="dxa"/>
+            <w:tcW w:w="818" w:type="dxa"/>
             <w:tcBorders>
               <w:right w:val="single" w:sz="12" w:space="0" w:color="666699"/>
             </w:tcBorders>
@@ -7099,6 +7209,14 @@
                 <w:szCs w:val="20"/>
               </w:rPr>
             </w:pPr>
+            <w:r>
+              <w:rPr>
+                <w:rFonts w:asciiTheme="minorHAnsi" w:hAnsiTheme="minorHAnsi" w:cstheme="minorHAnsi"/>
+                <w:sz w:val="20"/>
+                <w:szCs w:val="20"/>
+              </w:rPr>
+              <w:t>Y</w:t>
+            </w:r>
           </w:p>
         </w:tc>
         <w:tc>
@@ -7118,16 +7236,24 @@
         </w:tc>
         <w:tc>
           <w:tcPr>
-            <w:tcW w:w="1315" w:type="dxa"/>
-          </w:tcPr>
-          <w:p>
-            <w:pPr>
-              <w:rPr>
-                <w:rFonts w:asciiTheme="minorHAnsi" w:hAnsiTheme="minorHAnsi" w:cstheme="minorHAnsi"/>
-                <w:sz w:val="20"/>
-                <w:szCs w:val="20"/>
-              </w:rPr>
-            </w:pPr>
+            <w:tcW w:w="1411" w:type="dxa"/>
+          </w:tcPr>
+          <w:p>
+            <w:pPr>
+              <w:rPr>
+                <w:rFonts w:asciiTheme="minorHAnsi" w:hAnsiTheme="minorHAnsi" w:cstheme="minorHAnsi"/>
+                <w:sz w:val="20"/>
+                <w:szCs w:val="20"/>
+              </w:rPr>
+            </w:pPr>
+            <w:r>
+              <w:rPr>
+                <w:rFonts w:asciiTheme="minorHAnsi" w:hAnsiTheme="minorHAnsi" w:cstheme="minorHAnsi"/>
+                <w:sz w:val="20"/>
+                <w:szCs w:val="20"/>
+              </w:rPr>
+              <w:t xml:space="preserve">Require customization, which is included in the Package. </w:t>
+            </w:r>
           </w:p>
         </w:tc>
       </w:tr>
@@ -7154,13 +7280,14 @@
                 <w:sz w:val="20"/>
                 <w:szCs w:val="20"/>
               </w:rPr>
+              <w:lastRenderedPageBreak/>
               <w:t>6</w:t>
             </w:r>
           </w:p>
         </w:tc>
         <w:tc>
           <w:tcPr>
-            <w:tcW w:w="5526" w:type="dxa"/>
+            <w:tcW w:w="5431" w:type="dxa"/>
             <w:gridSpan w:val="2"/>
             <w:tcBorders>
               <w:right w:val="single" w:sz="12" w:space="0" w:color="666699"/>
@@ -7190,7 +7317,7 @@
         </w:tc>
         <w:tc>
           <w:tcPr>
-            <w:tcW w:w="819" w:type="dxa"/>
+            <w:tcW w:w="818" w:type="dxa"/>
             <w:tcBorders>
               <w:right w:val="single" w:sz="12" w:space="0" w:color="666699"/>
             </w:tcBorders>
@@ -7241,7 +7368,7 @@
         </w:tc>
         <w:tc>
           <w:tcPr>
-            <w:tcW w:w="1315" w:type="dxa"/>
+            <w:tcW w:w="1411" w:type="dxa"/>
           </w:tcPr>
           <w:p>
             <w:pPr>
@@ -7283,7 +7410,7 @@
         </w:tc>
         <w:tc>
           <w:tcPr>
-            <w:tcW w:w="5526" w:type="dxa"/>
+            <w:tcW w:w="5431" w:type="dxa"/>
             <w:gridSpan w:val="2"/>
             <w:tcBorders>
               <w:right w:val="single" w:sz="12" w:space="0" w:color="666699"/>
@@ -7361,7 +7488,7 @@
         </w:tc>
         <w:tc>
           <w:tcPr>
-            <w:tcW w:w="819" w:type="dxa"/>
+            <w:tcW w:w="818" w:type="dxa"/>
             <w:tcBorders>
               <w:right w:val="single" w:sz="12" w:space="0" w:color="666699"/>
             </w:tcBorders>
@@ -7401,6 +7528,14 @@
                 <w:szCs w:val="20"/>
               </w:rPr>
             </w:pPr>
+            <w:r>
+              <w:rPr>
+                <w:rFonts w:asciiTheme="minorHAnsi" w:hAnsiTheme="minorHAnsi" w:cstheme="minorHAnsi"/>
+                <w:sz w:val="20"/>
+                <w:szCs w:val="20"/>
+              </w:rPr>
+              <w:t>Y</w:t>
+            </w:r>
           </w:p>
         </w:tc>
         <w:tc>
@@ -7420,7 +7555,7 @@
         </w:tc>
         <w:tc>
           <w:tcPr>
-            <w:tcW w:w="1315" w:type="dxa"/>
+            <w:tcW w:w="1411" w:type="dxa"/>
           </w:tcPr>
           <w:p>
             <w:pPr>
@@ -7456,14 +7591,13 @@
                 <w:sz w:val="20"/>
                 <w:szCs w:val="20"/>
               </w:rPr>
-              <w:lastRenderedPageBreak/>
               <w:t>6.2</w:t>
             </w:r>
           </w:p>
         </w:tc>
         <w:tc>
           <w:tcPr>
-            <w:tcW w:w="5526" w:type="dxa"/>
+            <w:tcW w:w="5431" w:type="dxa"/>
             <w:gridSpan w:val="2"/>
             <w:tcBorders>
               <w:right w:val="single" w:sz="12" w:space="0" w:color="666699"/>
@@ -7613,7 +7747,7 @@
         </w:tc>
         <w:tc>
           <w:tcPr>
-            <w:tcW w:w="819" w:type="dxa"/>
+            <w:tcW w:w="818" w:type="dxa"/>
             <w:tcBorders>
               <w:right w:val="single" w:sz="12" w:space="0" w:color="666699"/>
             </w:tcBorders>
@@ -7653,6 +7787,14 @@
                 <w:szCs w:val="20"/>
               </w:rPr>
             </w:pPr>
+            <w:r>
+              <w:rPr>
+                <w:rFonts w:asciiTheme="minorHAnsi" w:hAnsiTheme="minorHAnsi" w:cstheme="minorHAnsi"/>
+                <w:sz w:val="20"/>
+                <w:szCs w:val="20"/>
+              </w:rPr>
+              <w:t>Y</w:t>
+            </w:r>
           </w:p>
         </w:tc>
         <w:tc>
@@ -7672,8 +7814,25 @@
         </w:tc>
         <w:tc>
           <w:tcPr>
-            <w:tcW w:w="1315" w:type="dxa"/>
-          </w:tcPr>
+            <w:tcW w:w="1411" w:type="dxa"/>
+          </w:tcPr>
+          <w:p>
+            <w:pPr>
+              <w:rPr>
+                <w:rFonts w:asciiTheme="minorHAnsi" w:hAnsiTheme="minorHAnsi" w:cstheme="minorHAnsi"/>
+                <w:sz w:val="20"/>
+                <w:szCs w:val="20"/>
+              </w:rPr>
+            </w:pPr>
+            <w:r>
+              <w:rPr>
+                <w:rFonts w:asciiTheme="minorHAnsi" w:hAnsiTheme="minorHAnsi" w:cstheme="minorHAnsi"/>
+                <w:sz w:val="20"/>
+                <w:szCs w:val="20"/>
+              </w:rPr>
+              <w:t xml:space="preserve">All of the required processes, shall be provided and implemented from a Tablet. Customer shall provide the equipment for this requirement. </w:t>
+            </w:r>
+          </w:p>
           <w:p>
             <w:pPr>
               <w:rPr>
@@ -7714,7 +7873,7 @@
         </w:tc>
         <w:tc>
           <w:tcPr>
-            <w:tcW w:w="5526" w:type="dxa"/>
+            <w:tcW w:w="5431" w:type="dxa"/>
             <w:gridSpan w:val="2"/>
             <w:tcBorders>
               <w:right w:val="single" w:sz="12" w:space="0" w:color="666699"/>
@@ -7750,7 +7909,7 @@
         </w:tc>
         <w:tc>
           <w:tcPr>
-            <w:tcW w:w="819" w:type="dxa"/>
+            <w:tcW w:w="818" w:type="dxa"/>
             <w:tcBorders>
               <w:right w:val="single" w:sz="12" w:space="0" w:color="666699"/>
             </w:tcBorders>
@@ -7801,7 +7960,7 @@
         </w:tc>
         <w:tc>
           <w:tcPr>
-            <w:tcW w:w="1315" w:type="dxa"/>
+            <w:tcW w:w="1411" w:type="dxa"/>
           </w:tcPr>
           <w:p>
             <w:pPr>
@@ -7843,7 +8002,7 @@
         </w:tc>
         <w:tc>
           <w:tcPr>
-            <w:tcW w:w="5526" w:type="dxa"/>
+            <w:tcW w:w="5431" w:type="dxa"/>
             <w:gridSpan w:val="2"/>
             <w:tcBorders>
               <w:right w:val="single" w:sz="12" w:space="0" w:color="666699"/>
@@ -7942,7 +8101,7 @@
         </w:tc>
         <w:tc>
           <w:tcPr>
-            <w:tcW w:w="819" w:type="dxa"/>
+            <w:tcW w:w="818" w:type="dxa"/>
             <w:tcBorders>
               <w:right w:val="single" w:sz="12" w:space="0" w:color="666699"/>
             </w:tcBorders>
@@ -7982,6 +8141,14 @@
                 <w:szCs w:val="20"/>
               </w:rPr>
             </w:pPr>
+            <w:r>
+              <w:rPr>
+                <w:rFonts w:asciiTheme="minorHAnsi" w:hAnsiTheme="minorHAnsi" w:cstheme="minorHAnsi"/>
+                <w:sz w:val="20"/>
+                <w:szCs w:val="20"/>
+              </w:rPr>
+              <w:t>Y</w:t>
+            </w:r>
           </w:p>
         </w:tc>
         <w:tc>
@@ -8001,7 +8168,7 @@
         </w:tc>
         <w:tc>
           <w:tcPr>
-            <w:tcW w:w="1315" w:type="dxa"/>
+            <w:tcW w:w="1411" w:type="dxa"/>
           </w:tcPr>
           <w:p>
             <w:pPr>
@@ -8043,7 +8210,7 @@
         </w:tc>
         <w:tc>
           <w:tcPr>
-            <w:tcW w:w="5526" w:type="dxa"/>
+            <w:tcW w:w="5431" w:type="dxa"/>
             <w:gridSpan w:val="2"/>
             <w:tcBorders>
               <w:right w:val="single" w:sz="12" w:space="0" w:color="666699"/>
@@ -8073,7 +8240,7 @@
         </w:tc>
         <w:tc>
           <w:tcPr>
-            <w:tcW w:w="819" w:type="dxa"/>
+            <w:tcW w:w="818" w:type="dxa"/>
             <w:tcBorders>
               <w:right w:val="single" w:sz="12" w:space="0" w:color="666699"/>
             </w:tcBorders>
@@ -8124,7 +8291,7 @@
         </w:tc>
         <w:tc>
           <w:tcPr>
-            <w:tcW w:w="1315" w:type="dxa"/>
+            <w:tcW w:w="1411" w:type="dxa"/>
           </w:tcPr>
           <w:p>
             <w:pPr>
@@ -8166,7 +8333,7 @@
         </w:tc>
         <w:tc>
           <w:tcPr>
-            <w:tcW w:w="5526" w:type="dxa"/>
+            <w:tcW w:w="5431" w:type="dxa"/>
             <w:gridSpan w:val="2"/>
             <w:tcBorders>
               <w:right w:val="single" w:sz="12" w:space="0" w:color="666699"/>
@@ -8244,7 +8411,7 @@
         </w:tc>
         <w:tc>
           <w:tcPr>
-            <w:tcW w:w="819" w:type="dxa"/>
+            <w:tcW w:w="818" w:type="dxa"/>
             <w:tcBorders>
               <w:right w:val="single" w:sz="12" w:space="0" w:color="666699"/>
             </w:tcBorders>
@@ -8303,16 +8470,24 @@
         </w:tc>
         <w:tc>
           <w:tcPr>
-            <w:tcW w:w="1315" w:type="dxa"/>
-          </w:tcPr>
-          <w:p>
-            <w:pPr>
-              <w:rPr>
-                <w:rFonts w:asciiTheme="minorHAnsi" w:hAnsiTheme="minorHAnsi" w:cstheme="minorHAnsi"/>
-                <w:sz w:val="20"/>
-                <w:szCs w:val="20"/>
-              </w:rPr>
-            </w:pPr>
+            <w:tcW w:w="1411" w:type="dxa"/>
+          </w:tcPr>
+          <w:p>
+            <w:pPr>
+              <w:rPr>
+                <w:rFonts w:asciiTheme="minorHAnsi" w:hAnsiTheme="minorHAnsi" w:cstheme="minorHAnsi"/>
+                <w:sz w:val="20"/>
+                <w:szCs w:val="20"/>
+              </w:rPr>
+            </w:pPr>
+            <w:r>
+              <w:rPr>
+                <w:rFonts w:asciiTheme="minorHAnsi" w:hAnsiTheme="minorHAnsi" w:cstheme="minorHAnsi"/>
+                <w:sz w:val="20"/>
+                <w:szCs w:val="20"/>
+              </w:rPr>
+              <w:t xml:space="preserve">Primary Email Notifications are implemented </w:t>
+            </w:r>
           </w:p>
         </w:tc>
       </w:tr>
@@ -8345,7 +8520,7 @@
         </w:tc>
         <w:tc>
           <w:tcPr>
-            <w:tcW w:w="5526" w:type="dxa"/>
+            <w:tcW w:w="5431" w:type="dxa"/>
             <w:gridSpan w:val="2"/>
             <w:tcBorders>
               <w:right w:val="single" w:sz="12" w:space="0" w:color="666699"/>
@@ -8423,7 +8598,7 @@
         </w:tc>
         <w:tc>
           <w:tcPr>
-            <w:tcW w:w="819" w:type="dxa"/>
+            <w:tcW w:w="818" w:type="dxa"/>
             <w:tcBorders>
               <w:right w:val="single" w:sz="12" w:space="0" w:color="666699"/>
             </w:tcBorders>
@@ -8482,16 +8657,24 @@
         </w:tc>
         <w:tc>
           <w:tcPr>
-            <w:tcW w:w="1315" w:type="dxa"/>
-          </w:tcPr>
-          <w:p>
-            <w:pPr>
-              <w:rPr>
-                <w:rFonts w:asciiTheme="minorHAnsi" w:hAnsiTheme="minorHAnsi" w:cstheme="minorHAnsi"/>
-                <w:sz w:val="20"/>
-                <w:szCs w:val="20"/>
-              </w:rPr>
-            </w:pPr>
+            <w:tcW w:w="1411" w:type="dxa"/>
+          </w:tcPr>
+          <w:p>
+            <w:pPr>
+              <w:rPr>
+                <w:rFonts w:asciiTheme="minorHAnsi" w:hAnsiTheme="minorHAnsi" w:cstheme="minorHAnsi"/>
+                <w:sz w:val="20"/>
+                <w:szCs w:val="20"/>
+              </w:rPr>
+            </w:pPr>
+            <w:r>
+              <w:rPr>
+                <w:rFonts w:asciiTheme="minorHAnsi" w:hAnsiTheme="minorHAnsi" w:cstheme="minorHAnsi"/>
+                <w:sz w:val="20"/>
+                <w:szCs w:val="20"/>
+              </w:rPr>
+              <w:t xml:space="preserve">Primary Email Notifications are implemented </w:t>
+            </w:r>
           </w:p>
         </w:tc>
       </w:tr>
@@ -8524,7 +8707,7 @@
         </w:tc>
         <w:tc>
           <w:tcPr>
-            <w:tcW w:w="5526" w:type="dxa"/>
+            <w:tcW w:w="5431" w:type="dxa"/>
             <w:gridSpan w:val="2"/>
             <w:tcBorders>
               <w:right w:val="single" w:sz="12" w:space="0" w:color="666699"/>
@@ -8554,7 +8737,7 @@
         </w:tc>
         <w:tc>
           <w:tcPr>
-            <w:tcW w:w="819" w:type="dxa"/>
+            <w:tcW w:w="818" w:type="dxa"/>
             <w:tcBorders>
               <w:right w:val="single" w:sz="12" w:space="0" w:color="666699"/>
             </w:tcBorders>
@@ -8605,7 +8788,7 @@
         </w:tc>
         <w:tc>
           <w:tcPr>
-            <w:tcW w:w="1315" w:type="dxa"/>
+            <w:tcW w:w="1411" w:type="dxa"/>
           </w:tcPr>
           <w:p>
             <w:pPr>
@@ -8647,7 +8830,7 @@
         </w:tc>
         <w:tc>
           <w:tcPr>
-            <w:tcW w:w="5526" w:type="dxa"/>
+            <w:tcW w:w="5431" w:type="dxa"/>
             <w:gridSpan w:val="2"/>
             <w:tcBorders>
               <w:right w:val="single" w:sz="12" w:space="0" w:color="666699"/>
@@ -8797,7 +8980,7 @@
         </w:tc>
         <w:tc>
           <w:tcPr>
-            <w:tcW w:w="819" w:type="dxa"/>
+            <w:tcW w:w="818" w:type="dxa"/>
             <w:tcBorders>
               <w:right w:val="single" w:sz="12" w:space="0" w:color="666699"/>
             </w:tcBorders>
@@ -8837,6 +9020,14 @@
                 <w:szCs w:val="20"/>
               </w:rPr>
             </w:pPr>
+            <w:r>
+              <w:rPr>
+                <w:rFonts w:asciiTheme="minorHAnsi" w:hAnsiTheme="minorHAnsi" w:cstheme="minorHAnsi"/>
+                <w:sz w:val="20"/>
+                <w:szCs w:val="20"/>
+              </w:rPr>
+              <w:t>Y</w:t>
+            </w:r>
           </w:p>
         </w:tc>
         <w:tc>
@@ -8856,7 +9047,7 @@
         </w:tc>
         <w:tc>
           <w:tcPr>
-            <w:tcW w:w="1315" w:type="dxa"/>
+            <w:tcW w:w="1411" w:type="dxa"/>
           </w:tcPr>
           <w:p>
             <w:pPr>
@@ -8899,7 +9090,7 @@
         </w:tc>
         <w:tc>
           <w:tcPr>
-            <w:tcW w:w="5526" w:type="dxa"/>
+            <w:tcW w:w="5431" w:type="dxa"/>
             <w:gridSpan w:val="2"/>
             <w:tcBorders>
               <w:right w:val="single" w:sz="12" w:space="0" w:color="666699"/>
@@ -9051,7 +9242,7 @@
         </w:tc>
         <w:tc>
           <w:tcPr>
-            <w:tcW w:w="819" w:type="dxa"/>
+            <w:tcW w:w="818" w:type="dxa"/>
             <w:tcBorders>
               <w:right w:val="single" w:sz="12" w:space="0" w:color="666699"/>
             </w:tcBorders>
@@ -9091,6 +9282,14 @@
                 <w:szCs w:val="20"/>
               </w:rPr>
             </w:pPr>
+            <w:r>
+              <w:rPr>
+                <w:rFonts w:asciiTheme="minorHAnsi" w:hAnsiTheme="minorHAnsi" w:cstheme="minorHAnsi"/>
+                <w:sz w:val="20"/>
+                <w:szCs w:val="20"/>
+              </w:rPr>
+              <w:t>Y</w:t>
+            </w:r>
           </w:p>
         </w:tc>
         <w:tc>
@@ -9110,16 +9309,24 @@
         </w:tc>
         <w:tc>
           <w:tcPr>
-            <w:tcW w:w="1315" w:type="dxa"/>
-          </w:tcPr>
-          <w:p>
-            <w:pPr>
-              <w:rPr>
-                <w:rFonts w:asciiTheme="minorHAnsi" w:hAnsiTheme="minorHAnsi" w:cstheme="minorHAnsi"/>
-                <w:sz w:val="20"/>
-                <w:szCs w:val="20"/>
-              </w:rPr>
-            </w:pPr>
+            <w:tcW w:w="1411" w:type="dxa"/>
+          </w:tcPr>
+          <w:p>
+            <w:pPr>
+              <w:rPr>
+                <w:rFonts w:asciiTheme="minorHAnsi" w:hAnsiTheme="minorHAnsi" w:cstheme="minorHAnsi"/>
+                <w:sz w:val="20"/>
+                <w:szCs w:val="20"/>
+              </w:rPr>
+            </w:pPr>
+            <w:r>
+              <w:rPr>
+                <w:rFonts w:asciiTheme="minorHAnsi" w:hAnsiTheme="minorHAnsi" w:cstheme="minorHAnsi"/>
+                <w:sz w:val="20"/>
+                <w:szCs w:val="20"/>
+              </w:rPr>
+              <w:t xml:space="preserve">Note that connection with SSO or AD is not part of the implementation scope. </w:t>
+            </w:r>
           </w:p>
         </w:tc>
       </w:tr>
@@ -9152,7 +9359,7 @@
         </w:tc>
         <w:tc>
           <w:tcPr>
-            <w:tcW w:w="5526" w:type="dxa"/>
+            <w:tcW w:w="5431" w:type="dxa"/>
             <w:gridSpan w:val="2"/>
             <w:tcBorders>
               <w:right w:val="single" w:sz="12" w:space="0" w:color="666699"/>
@@ -9255,7 +9462,7 @@
         </w:tc>
         <w:tc>
           <w:tcPr>
-            <w:tcW w:w="819" w:type="dxa"/>
+            <w:tcW w:w="818" w:type="dxa"/>
             <w:tcBorders>
               <w:right w:val="single" w:sz="12" w:space="0" w:color="666699"/>
             </w:tcBorders>
@@ -9295,6 +9502,14 @@
                 <w:szCs w:val="20"/>
               </w:rPr>
             </w:pPr>
+            <w:r>
+              <w:rPr>
+                <w:rFonts w:asciiTheme="minorHAnsi" w:hAnsiTheme="minorHAnsi" w:cstheme="minorHAnsi"/>
+                <w:sz w:val="20"/>
+                <w:szCs w:val="20"/>
+              </w:rPr>
+              <w:t>Y</w:t>
+            </w:r>
           </w:p>
         </w:tc>
         <w:tc>
@@ -9314,7 +9529,7 @@
         </w:tc>
         <w:tc>
           <w:tcPr>
-            <w:tcW w:w="1315" w:type="dxa"/>
+            <w:tcW w:w="1411" w:type="dxa"/>
           </w:tcPr>
           <w:p>
             <w:pPr>
@@ -9356,7 +9571,7 @@
         </w:tc>
         <w:tc>
           <w:tcPr>
-            <w:tcW w:w="5526" w:type="dxa"/>
+            <w:tcW w:w="5431" w:type="dxa"/>
             <w:gridSpan w:val="2"/>
             <w:tcBorders>
               <w:right w:val="single" w:sz="12" w:space="0" w:color="666699"/>
@@ -9392,7 +9607,7 @@
         </w:tc>
         <w:tc>
           <w:tcPr>
-            <w:tcW w:w="819" w:type="dxa"/>
+            <w:tcW w:w="818" w:type="dxa"/>
             <w:tcBorders>
               <w:right w:val="single" w:sz="12" w:space="0" w:color="666699"/>
             </w:tcBorders>
@@ -9443,7 +9658,7 @@
         </w:tc>
         <w:tc>
           <w:tcPr>
-            <w:tcW w:w="1315" w:type="dxa"/>
+            <w:tcW w:w="1411" w:type="dxa"/>
           </w:tcPr>
           <w:p>
             <w:pPr>
@@ -9485,7 +9700,7 @@
         </w:tc>
         <w:tc>
           <w:tcPr>
-            <w:tcW w:w="5526" w:type="dxa"/>
+            <w:tcW w:w="5431" w:type="dxa"/>
             <w:gridSpan w:val="2"/>
             <w:tcBorders>
               <w:right w:val="single" w:sz="12" w:space="0" w:color="666699"/>
@@ -9563,7 +9778,7 @@
         </w:tc>
         <w:tc>
           <w:tcPr>
-            <w:tcW w:w="819" w:type="dxa"/>
+            <w:tcW w:w="818" w:type="dxa"/>
             <w:tcBorders>
               <w:right w:val="single" w:sz="12" w:space="0" w:color="666699"/>
             </w:tcBorders>
@@ -9603,6 +9818,14 @@
                 <w:szCs w:val="20"/>
               </w:rPr>
             </w:pPr>
+            <w:r>
+              <w:rPr>
+                <w:rFonts w:asciiTheme="minorHAnsi" w:hAnsiTheme="minorHAnsi" w:cstheme="minorHAnsi"/>
+                <w:sz w:val="20"/>
+                <w:szCs w:val="20"/>
+              </w:rPr>
+              <w:t>Y</w:t>
+            </w:r>
           </w:p>
         </w:tc>
         <w:tc>
@@ -9622,7 +9845,7 @@
         </w:tc>
         <w:tc>
           <w:tcPr>
-            <w:tcW w:w="1315" w:type="dxa"/>
+            <w:tcW w:w="1411" w:type="dxa"/>
           </w:tcPr>
           <w:p>
             <w:pPr>
@@ -9664,7 +9887,7 @@
         </w:tc>
         <w:tc>
           <w:tcPr>
-            <w:tcW w:w="5526" w:type="dxa"/>
+            <w:tcW w:w="5431" w:type="dxa"/>
             <w:gridSpan w:val="2"/>
             <w:tcBorders>
               <w:right w:val="single" w:sz="12" w:space="0" w:color="666699"/>
@@ -9849,7 +10072,7 @@
         </w:tc>
         <w:tc>
           <w:tcPr>
-            <w:tcW w:w="819" w:type="dxa"/>
+            <w:tcW w:w="818" w:type="dxa"/>
             <w:tcBorders>
               <w:right w:val="single" w:sz="12" w:space="0" w:color="666699"/>
             </w:tcBorders>
@@ -9889,6 +10112,14 @@
                 <w:szCs w:val="20"/>
               </w:rPr>
             </w:pPr>
+            <w:r>
+              <w:rPr>
+                <w:rFonts w:asciiTheme="minorHAnsi" w:hAnsiTheme="minorHAnsi" w:cstheme="minorHAnsi"/>
+                <w:sz w:val="20"/>
+                <w:szCs w:val="20"/>
+              </w:rPr>
+              <w:t>Y</w:t>
+            </w:r>
           </w:p>
         </w:tc>
         <w:tc>
@@ -9908,7 +10139,7 @@
         </w:tc>
         <w:tc>
           <w:tcPr>
-            <w:tcW w:w="1315" w:type="dxa"/>
+            <w:tcW w:w="1411" w:type="dxa"/>
           </w:tcPr>
           <w:p>
             <w:pPr>
@@ -9944,13 +10175,14 @@
                 <w:sz w:val="20"/>
                 <w:szCs w:val="20"/>
               </w:rPr>
+              <w:lastRenderedPageBreak/>
               <w:t>10.3</w:t>
             </w:r>
           </w:p>
         </w:tc>
         <w:tc>
           <w:tcPr>
-            <w:tcW w:w="5526" w:type="dxa"/>
+            <w:tcW w:w="5431" w:type="dxa"/>
             <w:gridSpan w:val="2"/>
             <w:tcBorders>
               <w:right w:val="single" w:sz="12" w:space="0" w:color="666699"/>
@@ -10028,7 +10260,7 @@
         </w:tc>
         <w:tc>
           <w:tcPr>
-            <w:tcW w:w="819" w:type="dxa"/>
+            <w:tcW w:w="818" w:type="dxa"/>
             <w:tcBorders>
               <w:right w:val="single" w:sz="12" w:space="0" w:color="666699"/>
             </w:tcBorders>
@@ -10068,6 +10300,14 @@
                 <w:szCs w:val="20"/>
               </w:rPr>
             </w:pPr>
+            <w:r>
+              <w:rPr>
+                <w:rFonts w:asciiTheme="minorHAnsi" w:hAnsiTheme="minorHAnsi" w:cstheme="minorHAnsi"/>
+                <w:sz w:val="20"/>
+                <w:szCs w:val="20"/>
+              </w:rPr>
+              <w:t>Y</w:t>
+            </w:r>
           </w:p>
         </w:tc>
         <w:tc>
@@ -10087,7 +10327,7 @@
         </w:tc>
         <w:tc>
           <w:tcPr>
-            <w:tcW w:w="1315" w:type="dxa"/>
+            <w:tcW w:w="1411" w:type="dxa"/>
           </w:tcPr>
           <w:p>
             <w:pPr>
@@ -10123,14 +10363,13 @@
                 <w:sz w:val="20"/>
                 <w:szCs w:val="20"/>
               </w:rPr>
-              <w:lastRenderedPageBreak/>
               <w:t>10.4</w:t>
             </w:r>
           </w:p>
         </w:tc>
         <w:tc>
           <w:tcPr>
-            <w:tcW w:w="5526" w:type="dxa"/>
+            <w:tcW w:w="5431" w:type="dxa"/>
             <w:gridSpan w:val="2"/>
             <w:tcBorders>
               <w:right w:val="single" w:sz="12" w:space="0" w:color="666699"/>
@@ -10318,7 +10557,7 @@
         </w:tc>
         <w:tc>
           <w:tcPr>
-            <w:tcW w:w="819" w:type="dxa"/>
+            <w:tcW w:w="818" w:type="dxa"/>
             <w:tcBorders>
               <w:right w:val="single" w:sz="12" w:space="0" w:color="666699"/>
             </w:tcBorders>
@@ -10358,6 +10597,14 @@
                 <w:szCs w:val="20"/>
               </w:rPr>
             </w:pPr>
+            <w:r>
+              <w:rPr>
+                <w:rFonts w:asciiTheme="minorHAnsi" w:hAnsiTheme="minorHAnsi" w:cstheme="minorHAnsi"/>
+                <w:sz w:val="20"/>
+                <w:szCs w:val="20"/>
+              </w:rPr>
+              <w:t>Y</w:t>
+            </w:r>
           </w:p>
         </w:tc>
         <w:tc>
@@ -10377,7 +10624,7 @@
         </w:tc>
         <w:tc>
           <w:tcPr>
-            <w:tcW w:w="1315" w:type="dxa"/>
+            <w:tcW w:w="1411" w:type="dxa"/>
           </w:tcPr>
           <w:p>
             <w:pPr>
@@ -10419,7 +10666,7 @@
         </w:tc>
         <w:tc>
           <w:tcPr>
-            <w:tcW w:w="5526" w:type="dxa"/>
+            <w:tcW w:w="5431" w:type="dxa"/>
             <w:gridSpan w:val="2"/>
             <w:tcBorders>
               <w:right w:val="single" w:sz="12" w:space="0" w:color="666699"/>
@@ -10449,7 +10696,7 @@
         </w:tc>
         <w:tc>
           <w:tcPr>
-            <w:tcW w:w="819" w:type="dxa"/>
+            <w:tcW w:w="818" w:type="dxa"/>
             <w:tcBorders>
               <w:right w:val="single" w:sz="12" w:space="0" w:color="666699"/>
             </w:tcBorders>
@@ -10500,7 +10747,7 @@
         </w:tc>
         <w:tc>
           <w:tcPr>
-            <w:tcW w:w="1315" w:type="dxa"/>
+            <w:tcW w:w="1411" w:type="dxa"/>
           </w:tcPr>
           <w:p>
             <w:pPr>
@@ -10542,7 +10789,7 @@
         </w:tc>
         <w:tc>
           <w:tcPr>
-            <w:tcW w:w="5526" w:type="dxa"/>
+            <w:tcW w:w="5431" w:type="dxa"/>
             <w:gridSpan w:val="2"/>
             <w:tcBorders>
               <w:right w:val="single" w:sz="12" w:space="0" w:color="666699"/>
@@ -10596,7 +10843,7 @@
         </w:tc>
         <w:tc>
           <w:tcPr>
-            <w:tcW w:w="819" w:type="dxa"/>
+            <w:tcW w:w="818" w:type="dxa"/>
             <w:tcBorders>
               <w:right w:val="single" w:sz="12" w:space="0" w:color="666699"/>
             </w:tcBorders>
@@ -10636,6 +10883,14 @@
                 <w:szCs w:val="20"/>
               </w:rPr>
             </w:pPr>
+            <w:r>
+              <w:rPr>
+                <w:rFonts w:asciiTheme="minorHAnsi" w:hAnsiTheme="minorHAnsi" w:cstheme="minorHAnsi"/>
+                <w:sz w:val="20"/>
+                <w:szCs w:val="20"/>
+              </w:rPr>
+              <w:t>Y</w:t>
+            </w:r>
           </w:p>
         </w:tc>
         <w:tc>
@@ -10655,8 +10910,25 @@
         </w:tc>
         <w:tc>
           <w:tcPr>
-            <w:tcW w:w="1315" w:type="dxa"/>
-          </w:tcPr>
+            <w:tcW w:w="1411" w:type="dxa"/>
+          </w:tcPr>
+          <w:p>
+            <w:pPr>
+              <w:rPr>
+                <w:rFonts w:asciiTheme="minorHAnsi" w:hAnsiTheme="minorHAnsi" w:cstheme="minorHAnsi"/>
+                <w:sz w:val="20"/>
+                <w:szCs w:val="20"/>
+              </w:rPr>
+            </w:pPr>
+            <w:r>
+              <w:rPr>
+                <w:rFonts w:asciiTheme="minorHAnsi" w:hAnsiTheme="minorHAnsi" w:cstheme="minorHAnsi"/>
+                <w:sz w:val="20"/>
+                <w:szCs w:val="20"/>
+              </w:rPr>
+              <w:t xml:space="preserve">The uptime of the services are viable, but the integration to Emails, and Smart Lockers may not, as this may be due to equipment failure or internet outages that are beyond our controls. </w:t>
+            </w:r>
+          </w:p>
           <w:p>
             <w:pPr>
               <w:rPr>
@@ -10697,7 +10969,7 @@
         </w:tc>
         <w:tc>
           <w:tcPr>
-            <w:tcW w:w="5526" w:type="dxa"/>
+            <w:tcW w:w="5431" w:type="dxa"/>
             <w:gridSpan w:val="2"/>
             <w:tcBorders>
               <w:right w:val="single" w:sz="12" w:space="0" w:color="666699"/>
@@ -10828,7 +11100,7 @@
         </w:tc>
         <w:tc>
           <w:tcPr>
-            <w:tcW w:w="819" w:type="dxa"/>
+            <w:tcW w:w="818" w:type="dxa"/>
             <w:tcBorders>
               <w:right w:val="single" w:sz="12" w:space="0" w:color="666699"/>
             </w:tcBorders>
@@ -10868,6 +11140,14 @@
                 <w:szCs w:val="20"/>
               </w:rPr>
             </w:pPr>
+            <w:r>
+              <w:rPr>
+                <w:rFonts w:asciiTheme="minorHAnsi" w:hAnsiTheme="minorHAnsi" w:cstheme="minorHAnsi"/>
+                <w:sz w:val="20"/>
+                <w:szCs w:val="20"/>
+              </w:rPr>
+              <w:t>Y</w:t>
+            </w:r>
           </w:p>
         </w:tc>
         <w:tc>
@@ -10887,16 +11167,41 @@
         </w:tc>
         <w:tc>
           <w:tcPr>
-            <w:tcW w:w="1315" w:type="dxa"/>
-          </w:tcPr>
-          <w:p>
-            <w:pPr>
-              <w:rPr>
-                <w:rFonts w:asciiTheme="minorHAnsi" w:hAnsiTheme="minorHAnsi" w:cstheme="minorHAnsi"/>
-                <w:sz w:val="20"/>
-                <w:szCs w:val="20"/>
-              </w:rPr>
-            </w:pPr>
+            <w:tcW w:w="1411" w:type="dxa"/>
+          </w:tcPr>
+          <w:p>
+            <w:pPr>
+              <w:rPr>
+                <w:rFonts w:asciiTheme="minorHAnsi" w:hAnsiTheme="minorHAnsi" w:cstheme="minorHAnsi"/>
+                <w:sz w:val="20"/>
+                <w:szCs w:val="20"/>
+              </w:rPr>
+            </w:pPr>
+            <w:r>
+              <w:rPr>
+                <w:rFonts w:asciiTheme="minorHAnsi" w:hAnsiTheme="minorHAnsi" w:cstheme="minorHAnsi"/>
+                <w:sz w:val="20"/>
+                <w:szCs w:val="20"/>
+              </w:rPr>
+              <w:t xml:space="preserve">Effectively, there are some outages that might not be within our control, similar to 11.1. </w:t>
+            </w:r>
+          </w:p>
+          <w:p>
+            <w:pPr>
+              <w:rPr>
+                <w:rFonts w:asciiTheme="minorHAnsi" w:hAnsiTheme="minorHAnsi" w:cstheme="minorHAnsi"/>
+                <w:sz w:val="20"/>
+                <w:szCs w:val="20"/>
+              </w:rPr>
+            </w:pPr>
+            <w:r>
+              <w:rPr>
+                <w:rFonts w:asciiTheme="minorHAnsi" w:hAnsiTheme="minorHAnsi" w:cstheme="minorHAnsi"/>
+                <w:sz w:val="20"/>
+                <w:szCs w:val="20"/>
+              </w:rPr>
+              <w:t xml:space="preserve"> </w:t>
+            </w:r>
           </w:p>
         </w:tc>
       </w:tr>
@@ -10923,13 +11228,14 @@
                 <w:sz w:val="20"/>
                 <w:szCs w:val="20"/>
               </w:rPr>
+              <w:lastRenderedPageBreak/>
               <w:t>11.3</w:t>
             </w:r>
           </w:p>
         </w:tc>
         <w:tc>
           <w:tcPr>
-            <w:tcW w:w="5526" w:type="dxa"/>
+            <w:tcW w:w="5431" w:type="dxa"/>
             <w:gridSpan w:val="2"/>
             <w:tcBorders>
               <w:right w:val="single" w:sz="12" w:space="0" w:color="666699"/>
@@ -11007,7 +11313,7 @@
         </w:tc>
         <w:tc>
           <w:tcPr>
-            <w:tcW w:w="819" w:type="dxa"/>
+            <w:tcW w:w="818" w:type="dxa"/>
             <w:tcBorders>
               <w:right w:val="single" w:sz="12" w:space="0" w:color="666699"/>
             </w:tcBorders>
@@ -11047,6 +11353,14 @@
                 <w:szCs w:val="20"/>
               </w:rPr>
             </w:pPr>
+            <w:r>
+              <w:rPr>
+                <w:rFonts w:asciiTheme="minorHAnsi" w:hAnsiTheme="minorHAnsi" w:cstheme="minorHAnsi"/>
+                <w:sz w:val="20"/>
+                <w:szCs w:val="20"/>
+              </w:rPr>
+              <w:t>Y</w:t>
+            </w:r>
           </w:p>
         </w:tc>
         <w:tc>
@@ -11066,7 +11380,7 @@
         </w:tc>
         <w:tc>
           <w:tcPr>
-            <w:tcW w:w="1315" w:type="dxa"/>
+            <w:tcW w:w="1411" w:type="dxa"/>
           </w:tcPr>
           <w:p>
             <w:pPr>
@@ -11102,14 +11416,13 @@
                 <w:sz w:val="20"/>
                 <w:szCs w:val="20"/>
               </w:rPr>
-              <w:lastRenderedPageBreak/>
               <w:t>11.4</w:t>
             </w:r>
           </w:p>
         </w:tc>
         <w:tc>
           <w:tcPr>
-            <w:tcW w:w="5526" w:type="dxa"/>
+            <w:tcW w:w="5431" w:type="dxa"/>
             <w:gridSpan w:val="2"/>
             <w:tcBorders>
               <w:right w:val="single" w:sz="12" w:space="0" w:color="666699"/>
@@ -11230,7 +11543,7 @@
         </w:tc>
         <w:tc>
           <w:tcPr>
-            <w:tcW w:w="819" w:type="dxa"/>
+            <w:tcW w:w="818" w:type="dxa"/>
             <w:tcBorders>
               <w:right w:val="single" w:sz="12" w:space="0" w:color="666699"/>
             </w:tcBorders>
@@ -11270,6 +11583,14 @@
                 <w:szCs w:val="20"/>
               </w:rPr>
             </w:pPr>
+            <w:r>
+              <w:rPr>
+                <w:rFonts w:asciiTheme="minorHAnsi" w:hAnsiTheme="minorHAnsi" w:cstheme="minorHAnsi"/>
+                <w:sz w:val="20"/>
+                <w:szCs w:val="20"/>
+              </w:rPr>
+              <w:t>Y</w:t>
+            </w:r>
           </w:p>
         </w:tc>
         <w:tc>
@@ -11289,16 +11610,42 @@
         </w:tc>
         <w:tc>
           <w:tcPr>
-            <w:tcW w:w="1315" w:type="dxa"/>
-          </w:tcPr>
-          <w:p>
-            <w:pPr>
-              <w:rPr>
-                <w:rFonts w:asciiTheme="minorHAnsi" w:hAnsiTheme="minorHAnsi" w:cstheme="minorHAnsi"/>
-                <w:sz w:val="20"/>
-                <w:szCs w:val="20"/>
-              </w:rPr>
-            </w:pPr>
+            <w:tcW w:w="1411" w:type="dxa"/>
+          </w:tcPr>
+          <w:p>
+            <w:pPr>
+              <w:rPr>
+                <w:rFonts w:asciiTheme="minorHAnsi" w:hAnsiTheme="minorHAnsi" w:cstheme="minorHAnsi"/>
+                <w:sz w:val="20"/>
+                <w:szCs w:val="20"/>
+              </w:rPr>
+            </w:pPr>
+            <w:r>
+              <w:rPr>
+                <w:rFonts w:asciiTheme="minorHAnsi" w:hAnsiTheme="minorHAnsi" w:cstheme="minorHAnsi"/>
+                <w:sz w:val="20"/>
+                <w:szCs w:val="20"/>
+              </w:rPr>
+              <w:t xml:space="preserve">As we would be deploying </w:t>
+            </w:r>
+            <w:proofErr w:type="spellStart"/>
+            <w:r>
+              <w:rPr>
+                <w:rFonts w:asciiTheme="minorHAnsi" w:hAnsiTheme="minorHAnsi" w:cstheme="minorHAnsi"/>
+                <w:sz w:val="20"/>
+                <w:szCs w:val="20"/>
+              </w:rPr>
+              <w:t>Vercel</w:t>
+            </w:r>
+            <w:proofErr w:type="spellEnd"/>
+            <w:r>
+              <w:rPr>
+                <w:rFonts w:asciiTheme="minorHAnsi" w:hAnsiTheme="minorHAnsi" w:cstheme="minorHAnsi"/>
+                <w:sz w:val="20"/>
+                <w:szCs w:val="20"/>
+              </w:rPr>
+              <w:t xml:space="preserve">, and the fixes shall be made within the operational hours on the ground. </w:t>
+            </w:r>
           </w:p>
         </w:tc>
       </w:tr>
@@ -11331,7 +11678,7 @@
         </w:tc>
         <w:tc>
           <w:tcPr>
-            <w:tcW w:w="5526" w:type="dxa"/>
+            <w:tcW w:w="5431" w:type="dxa"/>
             <w:gridSpan w:val="2"/>
             <w:tcBorders>
               <w:right w:val="single" w:sz="12" w:space="0" w:color="666699"/>
@@ -11361,7 +11708,7 @@
         </w:tc>
         <w:tc>
           <w:tcPr>
-            <w:tcW w:w="819" w:type="dxa"/>
+            <w:tcW w:w="818" w:type="dxa"/>
             <w:tcBorders>
               <w:right w:val="single" w:sz="12" w:space="0" w:color="666699"/>
             </w:tcBorders>
@@ -11412,7 +11759,7 @@
         </w:tc>
         <w:tc>
           <w:tcPr>
-            <w:tcW w:w="1315" w:type="dxa"/>
+            <w:tcW w:w="1411" w:type="dxa"/>
           </w:tcPr>
           <w:p>
             <w:pPr>
@@ -11454,7 +11801,7 @@
         </w:tc>
         <w:tc>
           <w:tcPr>
-            <w:tcW w:w="5526" w:type="dxa"/>
+            <w:tcW w:w="5431" w:type="dxa"/>
             <w:gridSpan w:val="2"/>
             <w:tcBorders>
               <w:right w:val="single" w:sz="12" w:space="0" w:color="666699"/>
@@ -11603,7 +11950,7 @@
         </w:tc>
         <w:tc>
           <w:tcPr>
-            <w:tcW w:w="819" w:type="dxa"/>
+            <w:tcW w:w="818" w:type="dxa"/>
             <w:tcBorders>
               <w:right w:val="single" w:sz="12" w:space="0" w:color="666699"/>
             </w:tcBorders>
@@ -11643,6 +11990,14 @@
                 <w:szCs w:val="20"/>
               </w:rPr>
             </w:pPr>
+            <w:r>
+              <w:rPr>
+                <w:rFonts w:asciiTheme="minorHAnsi" w:hAnsiTheme="minorHAnsi" w:cstheme="minorHAnsi"/>
+                <w:sz w:val="20"/>
+                <w:szCs w:val="20"/>
+              </w:rPr>
+              <w:t>Y</w:t>
+            </w:r>
           </w:p>
         </w:tc>
         <w:tc>
@@ -11662,7 +12017,7 @@
         </w:tc>
         <w:tc>
           <w:tcPr>
-            <w:tcW w:w="1315" w:type="dxa"/>
+            <w:tcW w:w="1411" w:type="dxa"/>
           </w:tcPr>
           <w:p>
             <w:pPr>
@@ -11704,7 +12059,7 @@
         </w:tc>
         <w:tc>
           <w:tcPr>
-            <w:tcW w:w="5526" w:type="dxa"/>
+            <w:tcW w:w="5431" w:type="dxa"/>
             <w:gridSpan w:val="2"/>
             <w:tcBorders>
               <w:right w:val="single" w:sz="12" w:space="0" w:color="666699"/>
@@ -11753,22 +12108,14 @@
                 <w:sz w:val="20"/>
                 <w:szCs w:val="20"/>
               </w:rPr>
-              <w:t xml:space="preserve">The Vendor shall be fully responsible for system hosting, infrastructure, security, and </w:t>
-            </w:r>
-            <w:r>
-              <w:rPr>
-                <w:rFonts w:asciiTheme="minorHAnsi" w:hAnsiTheme="minorHAnsi" w:cstheme="minorHAnsi"/>
-                <w:sz w:val="20"/>
-                <w:szCs w:val="20"/>
-              </w:rPr>
-              <w:t>operations.</w:t>
+              <w:t>The Vendor shall be fully responsible for system hosting, infrastructure, security, and operations.</w:t>
             </w:r>
           </w:p>
           <w:p/>
         </w:tc>
         <w:tc>
           <w:tcPr>
-            <w:tcW w:w="819" w:type="dxa"/>
+            <w:tcW w:w="818" w:type="dxa"/>
             <w:tcBorders>
               <w:right w:val="single" w:sz="12" w:space="0" w:color="666699"/>
             </w:tcBorders>
@@ -11808,6 +12155,14 @@
                 <w:szCs w:val="20"/>
               </w:rPr>
             </w:pPr>
+            <w:r>
+              <w:rPr>
+                <w:rFonts w:asciiTheme="minorHAnsi" w:hAnsiTheme="minorHAnsi" w:cstheme="minorHAnsi"/>
+                <w:sz w:val="20"/>
+                <w:szCs w:val="20"/>
+              </w:rPr>
+              <w:t>Y</w:t>
+            </w:r>
           </w:p>
         </w:tc>
         <w:tc>
@@ -11827,8 +12182,25 @@
         </w:tc>
         <w:tc>
           <w:tcPr>
-            <w:tcW w:w="1315" w:type="dxa"/>
-          </w:tcPr>
+            <w:tcW w:w="1411" w:type="dxa"/>
+          </w:tcPr>
+          <w:p>
+            <w:pPr>
+              <w:rPr>
+                <w:rFonts w:asciiTheme="minorHAnsi" w:hAnsiTheme="minorHAnsi" w:cstheme="minorHAnsi"/>
+                <w:sz w:val="20"/>
+                <w:szCs w:val="20"/>
+              </w:rPr>
+            </w:pPr>
+            <w:r>
+              <w:rPr>
+                <w:rFonts w:asciiTheme="minorHAnsi" w:hAnsiTheme="minorHAnsi" w:cstheme="minorHAnsi"/>
+                <w:sz w:val="20"/>
+                <w:szCs w:val="20"/>
+              </w:rPr>
+              <w:t xml:space="preserve">Excluding Student Emails and integration to Smart Lockers, since those are outside the scope. </w:t>
+            </w:r>
+          </w:p>
           <w:p>
             <w:pPr>
               <w:rPr>
@@ -11869,7 +12241,7 @@
         </w:tc>
         <w:tc>
           <w:tcPr>
-            <w:tcW w:w="5526" w:type="dxa"/>
+            <w:tcW w:w="5431" w:type="dxa"/>
             <w:gridSpan w:val="2"/>
             <w:tcBorders>
               <w:right w:val="single" w:sz="12" w:space="0" w:color="666699"/>
@@ -12003,7 +12375,7 @@
         </w:tc>
         <w:tc>
           <w:tcPr>
-            <w:tcW w:w="819" w:type="dxa"/>
+            <w:tcW w:w="818" w:type="dxa"/>
             <w:tcBorders>
               <w:right w:val="single" w:sz="12" w:space="0" w:color="666699"/>
             </w:tcBorders>
@@ -12043,6 +12415,14 @@
                 <w:szCs w:val="20"/>
               </w:rPr>
             </w:pPr>
+            <w:r>
+              <w:rPr>
+                <w:rFonts w:asciiTheme="minorHAnsi" w:hAnsiTheme="minorHAnsi" w:cstheme="minorHAnsi"/>
+                <w:sz w:val="20"/>
+                <w:szCs w:val="20"/>
+              </w:rPr>
+              <w:t>Y</w:t>
+            </w:r>
           </w:p>
         </w:tc>
         <w:tc>
@@ -12062,16 +12442,60 @@
         </w:tc>
         <w:tc>
           <w:tcPr>
-            <w:tcW w:w="1315" w:type="dxa"/>
-          </w:tcPr>
-          <w:p>
-            <w:pPr>
-              <w:rPr>
-                <w:rFonts w:asciiTheme="minorHAnsi" w:hAnsiTheme="minorHAnsi" w:cstheme="minorHAnsi"/>
-                <w:sz w:val="20"/>
-                <w:szCs w:val="20"/>
-              </w:rPr>
-            </w:pPr>
+            <w:tcW w:w="1411" w:type="dxa"/>
+          </w:tcPr>
+          <w:p>
+            <w:pPr>
+              <w:rPr>
+                <w:rFonts w:asciiTheme="minorHAnsi" w:hAnsiTheme="minorHAnsi" w:cstheme="minorHAnsi"/>
+                <w:sz w:val="20"/>
+                <w:szCs w:val="20"/>
+              </w:rPr>
+            </w:pPr>
+            <w:r>
+              <w:rPr>
+                <w:rFonts w:asciiTheme="minorHAnsi" w:hAnsiTheme="minorHAnsi" w:cstheme="minorHAnsi"/>
+                <w:sz w:val="20"/>
+                <w:szCs w:val="20"/>
+              </w:rPr>
+              <w:t xml:space="preserve">While BeyondSensor do not have the ISO Certifications, the deployed solution on </w:t>
+            </w:r>
+            <w:proofErr w:type="spellStart"/>
+            <w:r>
+              <w:rPr>
+                <w:rFonts w:asciiTheme="minorHAnsi" w:hAnsiTheme="minorHAnsi" w:cstheme="minorHAnsi"/>
+                <w:sz w:val="20"/>
+                <w:szCs w:val="20"/>
+              </w:rPr>
+              <w:t>Vercel</w:t>
+            </w:r>
+            <w:proofErr w:type="spellEnd"/>
+            <w:r>
+              <w:rPr>
+                <w:rFonts w:asciiTheme="minorHAnsi" w:hAnsiTheme="minorHAnsi" w:cstheme="minorHAnsi"/>
+                <w:sz w:val="20"/>
+                <w:szCs w:val="20"/>
+              </w:rPr>
+              <w:t xml:space="preserve">, and </w:t>
+            </w:r>
+            <w:proofErr w:type="spellStart"/>
+            <w:r>
+              <w:rPr>
+                <w:rFonts w:asciiTheme="minorHAnsi" w:hAnsiTheme="minorHAnsi" w:cstheme="minorHAnsi"/>
+                <w:sz w:val="20"/>
+                <w:szCs w:val="20"/>
+              </w:rPr>
+              <w:t>Supabase</w:t>
+            </w:r>
+            <w:proofErr w:type="spellEnd"/>
+            <w:r>
+              <w:rPr>
+                <w:rFonts w:asciiTheme="minorHAnsi" w:hAnsiTheme="minorHAnsi" w:cstheme="minorHAnsi"/>
+                <w:sz w:val="20"/>
+                <w:szCs w:val="20"/>
+              </w:rPr>
+              <w:t xml:space="preserve"> are ISO Certified environments. </w:t>
+            </w:r>
           </w:p>
         </w:tc>
       </w:tr>
@@ -12113,7 +12537,7 @@
         </w:tc>
         <w:tc>
           <w:tcPr>
-            <w:tcW w:w="5526" w:type="dxa"/>
+            <w:tcW w:w="5431" w:type="dxa"/>
             <w:gridSpan w:val="2"/>
             <w:tcBorders>
               <w:right w:val="single" w:sz="12" w:space="0" w:color="666699"/>
@@ -12291,7 +12715,7 @@
         </w:tc>
         <w:tc>
           <w:tcPr>
-            <w:tcW w:w="819" w:type="dxa"/>
+            <w:tcW w:w="818" w:type="dxa"/>
             <w:tcBorders>
               <w:right w:val="single" w:sz="12" w:space="0" w:color="666699"/>
             </w:tcBorders>
@@ -12331,6 +12755,14 @@
                 <w:szCs w:val="20"/>
               </w:rPr>
             </w:pPr>
+            <w:r>
+              <w:rPr>
+                <w:rFonts w:asciiTheme="minorHAnsi" w:hAnsiTheme="minorHAnsi" w:cstheme="minorHAnsi"/>
+                <w:sz w:val="20"/>
+                <w:szCs w:val="20"/>
+              </w:rPr>
+              <w:t>Y</w:t>
+            </w:r>
           </w:p>
         </w:tc>
         <w:tc>
@@ -12350,7 +12782,7 @@
         </w:tc>
         <w:tc>
           <w:tcPr>
-            <w:tcW w:w="1315" w:type="dxa"/>
+            <w:tcW w:w="1411" w:type="dxa"/>
           </w:tcPr>
           <w:p>
             <w:pPr>
@@ -12400,7 +12832,7 @@
         </w:tc>
         <w:tc>
           <w:tcPr>
-            <w:tcW w:w="5526" w:type="dxa"/>
+            <w:tcW w:w="5431" w:type="dxa"/>
             <w:gridSpan w:val="2"/>
             <w:tcBorders>
               <w:right w:val="single" w:sz="12" w:space="0" w:color="666699"/>
@@ -12478,7 +12910,7 @@
         </w:tc>
         <w:tc>
           <w:tcPr>
-            <w:tcW w:w="819" w:type="dxa"/>
+            <w:tcW w:w="818" w:type="dxa"/>
             <w:tcBorders>
               <w:right w:val="single" w:sz="12" w:space="0" w:color="666699"/>
             </w:tcBorders>
@@ -12518,6 +12950,14 @@
                 <w:szCs w:val="20"/>
               </w:rPr>
             </w:pPr>
+            <w:r>
+              <w:rPr>
+                <w:rFonts w:asciiTheme="minorHAnsi" w:hAnsiTheme="minorHAnsi" w:cstheme="minorHAnsi"/>
+                <w:sz w:val="20"/>
+                <w:szCs w:val="20"/>
+              </w:rPr>
+              <w:t>Y</w:t>
+            </w:r>
           </w:p>
         </w:tc>
         <w:tc>
@@ -12537,7 +12977,7 @@
         </w:tc>
         <w:tc>
           <w:tcPr>
-            <w:tcW w:w="1315" w:type="dxa"/>
+            <w:tcW w:w="1411" w:type="dxa"/>
           </w:tcPr>
           <w:p>
             <w:pPr>
@@ -12587,7 +13027,7 @@
         </w:tc>
         <w:tc>
           <w:tcPr>
-            <w:tcW w:w="5526" w:type="dxa"/>
+            <w:tcW w:w="5431" w:type="dxa"/>
             <w:gridSpan w:val="2"/>
             <w:tcBorders>
               <w:right w:val="single" w:sz="12" w:space="0" w:color="666699"/>
@@ -12689,7 +13129,7 @@
         </w:tc>
         <w:tc>
           <w:tcPr>
-            <w:tcW w:w="819" w:type="dxa"/>
+            <w:tcW w:w="818" w:type="dxa"/>
             <w:tcBorders>
               <w:right w:val="single" w:sz="12" w:space="0" w:color="666699"/>
             </w:tcBorders>
@@ -12729,6 +13169,14 @@
                 <w:szCs w:val="20"/>
               </w:rPr>
             </w:pPr>
+            <w:r>
+              <w:rPr>
+                <w:rFonts w:asciiTheme="minorHAnsi" w:hAnsiTheme="minorHAnsi" w:cstheme="minorHAnsi"/>
+                <w:sz w:val="20"/>
+                <w:szCs w:val="20"/>
+              </w:rPr>
+              <w:t>Y</w:t>
+            </w:r>
           </w:p>
         </w:tc>
         <w:tc>
@@ -12748,7 +13196,7 @@
         </w:tc>
         <w:tc>
           <w:tcPr>
-            <w:tcW w:w="1315" w:type="dxa"/>
+            <w:tcW w:w="1411" w:type="dxa"/>
           </w:tcPr>
           <w:p>
             <w:pPr>
@@ -12798,7 +13246,7 @@
         </w:tc>
         <w:tc>
           <w:tcPr>
-            <w:tcW w:w="5526" w:type="dxa"/>
+            <w:tcW w:w="5431" w:type="dxa"/>
             <w:gridSpan w:val="2"/>
             <w:tcBorders>
               <w:right w:val="single" w:sz="12" w:space="0" w:color="666699"/>
@@ -12906,7 +13354,7 @@
         </w:tc>
         <w:tc>
           <w:tcPr>
-            <w:tcW w:w="819" w:type="dxa"/>
+            <w:tcW w:w="818" w:type="dxa"/>
             <w:tcBorders>
               <w:right w:val="single" w:sz="12" w:space="0" w:color="666699"/>
             </w:tcBorders>
@@ -12946,6 +13394,14 @@
                 <w:szCs w:val="20"/>
               </w:rPr>
             </w:pPr>
+            <w:r>
+              <w:rPr>
+                <w:rFonts w:asciiTheme="minorHAnsi" w:hAnsiTheme="minorHAnsi" w:cstheme="minorHAnsi"/>
+                <w:sz w:val="20"/>
+                <w:szCs w:val="20"/>
+              </w:rPr>
+              <w:t>Y</w:t>
+            </w:r>
           </w:p>
         </w:tc>
         <w:tc>
@@ -12965,7 +13421,7 @@
         </w:tc>
         <w:tc>
           <w:tcPr>
-            <w:tcW w:w="1315" w:type="dxa"/>
+            <w:tcW w:w="1411" w:type="dxa"/>
           </w:tcPr>
           <w:p>
             <w:pPr>
@@ -13007,7 +13463,7 @@
         </w:tc>
         <w:tc>
           <w:tcPr>
-            <w:tcW w:w="5526" w:type="dxa"/>
+            <w:tcW w:w="5431" w:type="dxa"/>
             <w:gridSpan w:val="2"/>
             <w:tcBorders>
               <w:right w:val="single" w:sz="12" w:space="0" w:color="666699"/>
@@ -13053,7 +13509,7 @@
         </w:tc>
         <w:tc>
           <w:tcPr>
-            <w:tcW w:w="819" w:type="dxa"/>
+            <w:tcW w:w="818" w:type="dxa"/>
             <w:tcBorders>
               <w:right w:val="single" w:sz="12" w:space="0" w:color="666699"/>
             </w:tcBorders>
@@ -13104,7 +13560,7 @@
         </w:tc>
         <w:tc>
           <w:tcPr>
-            <w:tcW w:w="1315" w:type="dxa"/>
+            <w:tcW w:w="1411" w:type="dxa"/>
           </w:tcPr>
           <w:p>
             <w:pPr>
@@ -13146,7 +13602,7 @@
         </w:tc>
         <w:tc>
           <w:tcPr>
-            <w:tcW w:w="5526" w:type="dxa"/>
+            <w:tcW w:w="5431" w:type="dxa"/>
             <w:gridSpan w:val="2"/>
             <w:tcBorders>
               <w:right w:val="single" w:sz="12" w:space="0" w:color="666699"/>
@@ -13244,15 +13700,7 @@
                 <w:sz w:val="20"/>
                 <w:szCs w:val="20"/>
               </w:rPr>
-              <w:t xml:space="preserve"> up to 1000 e</w:t>
-            </w:r>
-            <w:r>
-              <w:rPr>
-                <w:rFonts w:asciiTheme="minorHAnsi" w:hAnsiTheme="minorHAnsi" w:cstheme="minorHAnsi"/>
-                <w:sz w:val="20"/>
-                <w:szCs w:val="20"/>
-              </w:rPr>
-              <w:t xml:space="preserve">quipment </w:t>
+              <w:t xml:space="preserve"> up to 1000 equipment </w:t>
             </w:r>
           </w:p>
           <w:p>
@@ -13304,15 +13752,7 @@
                 <w:sz w:val="20"/>
                 <w:szCs w:val="20"/>
               </w:rPr>
-              <w:t xml:space="preserve"> up to 1000 equipment</w:t>
-            </w:r>
-            <w:r>
-              <w:rPr>
-                <w:rFonts w:asciiTheme="minorHAnsi" w:hAnsiTheme="minorHAnsi" w:cstheme="minorHAnsi"/>
-                <w:sz w:val="20"/>
-                <w:szCs w:val="20"/>
-              </w:rPr>
-              <w:t xml:space="preserve"> </w:t>
+              <w:t xml:space="preserve"> up to 1000 equipment </w:t>
             </w:r>
           </w:p>
           <w:p>
@@ -13342,23 +13782,7 @@
                 <w:sz w:val="20"/>
                 <w:szCs w:val="20"/>
               </w:rPr>
-              <w:t xml:space="preserve"> </w:t>
-            </w:r>
-            <w:r>
-              <w:rPr>
-                <w:rFonts w:asciiTheme="minorHAnsi" w:hAnsiTheme="minorHAnsi" w:cstheme="minorHAnsi"/>
-                <w:sz w:val="20"/>
-                <w:szCs w:val="20"/>
-              </w:rPr>
-              <w:t xml:space="preserve">for </w:t>
-            </w:r>
-            <w:r>
-              <w:rPr>
-                <w:rFonts w:asciiTheme="minorHAnsi" w:hAnsiTheme="minorHAnsi" w:cstheme="minorHAnsi"/>
-                <w:sz w:val="20"/>
-                <w:szCs w:val="20"/>
-              </w:rPr>
-              <w:t>up to 1000 equipment</w:t>
+              <w:t xml:space="preserve"> for up to 1000 equipment</w:t>
             </w:r>
           </w:p>
           <w:p>
@@ -13408,7 +13832,7 @@
         </w:tc>
         <w:tc>
           <w:tcPr>
-            <w:tcW w:w="819" w:type="dxa"/>
+            <w:tcW w:w="818" w:type="dxa"/>
             <w:tcBorders>
               <w:right w:val="single" w:sz="12" w:space="0" w:color="666699"/>
             </w:tcBorders>
@@ -13448,6 +13872,14 @@
                 <w:szCs w:val="20"/>
               </w:rPr>
             </w:pPr>
+            <w:r>
+              <w:rPr>
+                <w:rFonts w:asciiTheme="minorHAnsi" w:hAnsiTheme="minorHAnsi" w:cstheme="minorHAnsi"/>
+                <w:sz w:val="20"/>
+                <w:szCs w:val="20"/>
+              </w:rPr>
+              <w:t>Y</w:t>
+            </w:r>
           </w:p>
         </w:tc>
         <w:tc>
@@ -13467,7 +13899,7 @@
         </w:tc>
         <w:tc>
           <w:tcPr>
-            <w:tcW w:w="1315" w:type="dxa"/>
+            <w:tcW w:w="1411" w:type="dxa"/>
           </w:tcPr>
           <w:p>
             <w:pPr>
@@ -13510,7 +13942,7 @@
         </w:tc>
         <w:tc>
           <w:tcPr>
-            <w:tcW w:w="5526" w:type="dxa"/>
+            <w:tcW w:w="5431" w:type="dxa"/>
             <w:gridSpan w:val="2"/>
             <w:tcBorders>
               <w:right w:val="single" w:sz="12" w:space="0" w:color="666699"/>
@@ -13588,7 +14020,7 @@
         </w:tc>
         <w:tc>
           <w:tcPr>
-            <w:tcW w:w="819" w:type="dxa"/>
+            <w:tcW w:w="818" w:type="dxa"/>
             <w:tcBorders>
               <w:right w:val="single" w:sz="12" w:space="0" w:color="666699"/>
             </w:tcBorders>
@@ -13628,6 +14060,14 @@
                 <w:szCs w:val="20"/>
               </w:rPr>
             </w:pPr>
+            <w:r>
+              <w:rPr>
+                <w:rFonts w:asciiTheme="minorHAnsi" w:hAnsiTheme="minorHAnsi" w:cstheme="minorHAnsi"/>
+                <w:sz w:val="20"/>
+                <w:szCs w:val="20"/>
+              </w:rPr>
+              <w:t>Y</w:t>
+            </w:r>
           </w:p>
         </w:tc>
         <w:tc>
@@ -13647,7 +14087,7 @@
         </w:tc>
         <w:tc>
           <w:tcPr>
-            <w:tcW w:w="1315" w:type="dxa"/>
+            <w:tcW w:w="1411" w:type="dxa"/>
           </w:tcPr>
           <w:p>
             <w:pPr>
@@ -13689,7 +14129,7 @@
         </w:tc>
         <w:tc>
           <w:tcPr>
-            <w:tcW w:w="5526" w:type="dxa"/>
+            <w:tcW w:w="5431" w:type="dxa"/>
             <w:gridSpan w:val="2"/>
             <w:tcBorders>
               <w:right w:val="single" w:sz="12" w:space="0" w:color="666699"/>
@@ -13767,7 +14207,7 @@
         </w:tc>
         <w:tc>
           <w:tcPr>
-            <w:tcW w:w="819" w:type="dxa"/>
+            <w:tcW w:w="818" w:type="dxa"/>
             <w:tcBorders>
               <w:right w:val="single" w:sz="12" w:space="0" w:color="666699"/>
             </w:tcBorders>
@@ -13807,6 +14247,14 @@
                 <w:szCs w:val="20"/>
               </w:rPr>
             </w:pPr>
+            <w:r>
+              <w:rPr>
+                <w:rFonts w:asciiTheme="minorHAnsi" w:hAnsiTheme="minorHAnsi" w:cstheme="minorHAnsi"/>
+                <w:sz w:val="20"/>
+                <w:szCs w:val="20"/>
+              </w:rPr>
+              <w:t>Y</w:t>
+            </w:r>
           </w:p>
         </w:tc>
         <w:tc>
@@ -13826,7 +14274,7 @@
         </w:tc>
         <w:tc>
           <w:tcPr>
-            <w:tcW w:w="1315" w:type="dxa"/>
+            <w:tcW w:w="1411" w:type="dxa"/>
           </w:tcPr>
           <w:p>
             <w:pPr>
@@ -13868,7 +14316,7 @@
         </w:tc>
         <w:tc>
           <w:tcPr>
-            <w:tcW w:w="5526" w:type="dxa"/>
+            <w:tcW w:w="5431" w:type="dxa"/>
             <w:gridSpan w:val="2"/>
             <w:tcBorders>
               <w:right w:val="single" w:sz="12" w:space="0" w:color="666699"/>
@@ -14013,7 +14461,7 @@
         </w:tc>
         <w:tc>
           <w:tcPr>
-            <w:tcW w:w="819" w:type="dxa"/>
+            <w:tcW w:w="818" w:type="dxa"/>
             <w:tcBorders>
               <w:right w:val="single" w:sz="12" w:space="0" w:color="666699"/>
             </w:tcBorders>
@@ -14053,6 +14501,14 @@
                 <w:szCs w:val="20"/>
               </w:rPr>
             </w:pPr>
+            <w:r>
+              <w:rPr>
+                <w:rFonts w:asciiTheme="minorHAnsi" w:hAnsiTheme="minorHAnsi" w:cstheme="minorHAnsi"/>
+                <w:sz w:val="20"/>
+                <w:szCs w:val="20"/>
+              </w:rPr>
+              <w:t>Y</w:t>
+            </w:r>
           </w:p>
         </w:tc>
         <w:tc>
@@ -14072,16 +14528,24 @@
         </w:tc>
         <w:tc>
           <w:tcPr>
-            <w:tcW w:w="1315" w:type="dxa"/>
-          </w:tcPr>
-          <w:p>
-            <w:pPr>
-              <w:rPr>
-                <w:rFonts w:asciiTheme="minorHAnsi" w:hAnsiTheme="minorHAnsi" w:cstheme="minorHAnsi"/>
-                <w:sz w:val="20"/>
-                <w:szCs w:val="20"/>
-              </w:rPr>
-            </w:pPr>
+            <w:tcW w:w="1411" w:type="dxa"/>
+          </w:tcPr>
+          <w:p>
+            <w:pPr>
+              <w:rPr>
+                <w:rFonts w:asciiTheme="minorHAnsi" w:hAnsiTheme="minorHAnsi" w:cstheme="minorHAnsi"/>
+                <w:sz w:val="20"/>
+                <w:szCs w:val="20"/>
+              </w:rPr>
+            </w:pPr>
+            <w:r>
+              <w:rPr>
+                <w:rFonts w:asciiTheme="minorHAnsi" w:hAnsiTheme="minorHAnsi" w:cstheme="minorHAnsi"/>
+                <w:sz w:val="20"/>
+                <w:szCs w:val="20"/>
+              </w:rPr>
+              <w:t xml:space="preserve">We will provide the necessary API for Integrations, and this would be part of the costs. However, more information about the locker would need to be provided by the Customer, so that we can establish the necessary flows. </w:t>
+            </w:r>
           </w:p>
         </w:tc>
       </w:tr>
@@ -14114,7 +14578,7 @@
         </w:tc>
         <w:tc>
           <w:tcPr>
-            <w:tcW w:w="5526" w:type="dxa"/>
+            <w:tcW w:w="5431" w:type="dxa"/>
             <w:gridSpan w:val="2"/>
             <w:tcBorders>
               <w:right w:val="single" w:sz="12" w:space="0" w:color="666699"/>
@@ -14150,7 +14614,7 @@
         </w:tc>
         <w:tc>
           <w:tcPr>
-            <w:tcW w:w="819" w:type="dxa"/>
+            <w:tcW w:w="818" w:type="dxa"/>
             <w:tcBorders>
               <w:right w:val="single" w:sz="12" w:space="0" w:color="666699"/>
             </w:tcBorders>
@@ -14201,7 +14665,7 @@
         </w:tc>
         <w:tc>
           <w:tcPr>
-            <w:tcW w:w="1315" w:type="dxa"/>
+            <w:tcW w:w="1411" w:type="dxa"/>
           </w:tcPr>
           <w:p>
             <w:pPr>
@@ -14237,13 +14701,14 @@
                 <w:sz w:val="20"/>
                 <w:szCs w:val="20"/>
               </w:rPr>
+              <w:lastRenderedPageBreak/>
               <w:t>15.1</w:t>
             </w:r>
           </w:p>
         </w:tc>
         <w:tc>
           <w:tcPr>
-            <w:tcW w:w="5526" w:type="dxa"/>
+            <w:tcW w:w="5431" w:type="dxa"/>
             <w:gridSpan w:val="2"/>
             <w:tcBorders>
               <w:right w:val="single" w:sz="12" w:space="0" w:color="666699"/>
@@ -14511,7 +14976,7 @@
         </w:tc>
         <w:tc>
           <w:tcPr>
-            <w:tcW w:w="819" w:type="dxa"/>
+            <w:tcW w:w="818" w:type="dxa"/>
             <w:tcBorders>
               <w:right w:val="single" w:sz="12" w:space="0" w:color="666699"/>
             </w:tcBorders>
@@ -14551,6 +15016,14 @@
                 <w:szCs w:val="20"/>
               </w:rPr>
             </w:pPr>
+            <w:r>
+              <w:rPr>
+                <w:rFonts w:asciiTheme="minorHAnsi" w:hAnsiTheme="minorHAnsi" w:cstheme="minorHAnsi"/>
+                <w:sz w:val="20"/>
+                <w:szCs w:val="20"/>
+              </w:rPr>
+              <w:t>M</w:t>
+            </w:r>
           </w:p>
         </w:tc>
         <w:tc>
@@ -14570,16 +15043,24 @@
         </w:tc>
         <w:tc>
           <w:tcPr>
-            <w:tcW w:w="1315" w:type="dxa"/>
-          </w:tcPr>
-          <w:p>
-            <w:pPr>
-              <w:rPr>
-                <w:rFonts w:asciiTheme="minorHAnsi" w:hAnsiTheme="minorHAnsi" w:cstheme="minorHAnsi"/>
-                <w:sz w:val="20"/>
-                <w:szCs w:val="20"/>
-              </w:rPr>
-            </w:pPr>
+            <w:tcW w:w="1411" w:type="dxa"/>
+          </w:tcPr>
+          <w:p>
+            <w:pPr>
+              <w:rPr>
+                <w:rFonts w:asciiTheme="minorHAnsi" w:hAnsiTheme="minorHAnsi" w:cstheme="minorHAnsi"/>
+                <w:sz w:val="20"/>
+                <w:szCs w:val="20"/>
+              </w:rPr>
+            </w:pPr>
+            <w:r>
+              <w:rPr>
+                <w:rFonts w:asciiTheme="minorHAnsi" w:hAnsiTheme="minorHAnsi" w:cstheme="minorHAnsi"/>
+                <w:sz w:val="20"/>
+                <w:szCs w:val="20"/>
+              </w:rPr>
+              <w:t xml:space="preserve">Would this include Students as well? Reason we are asking is that User training of a large scale may be challenging. Also, the number of sessions will also be difficult, so we need to see how we can manage this amongst the students. </w:t>
+            </w:r>
           </w:p>
         </w:tc>
       </w:tr>
@@ -14623,7 +15104,6 @@
           <w:szCs w:val="20"/>
           <w:u w:val="single"/>
         </w:rPr>
-        <w:lastRenderedPageBreak/>
         <w:t>C</w:t>
       </w:r>
       <w:r>
@@ -15290,6 +15770,7 @@
         </w:rPr>
         <w:t xml:space="preserve"> </w:t>
       </w:r>
+      <w:proofErr w:type="spellStart"/>
       <w:r>
         <w:rPr>
           <w:rFonts w:ascii="Arial" w:hAnsi="Arial" w:cs="Arial"/>
@@ -15297,7 +15778,17 @@
           <w:szCs w:val="20"/>
           <w:lang w:eastAsia="zh-CN"/>
         </w:rPr>
-        <w:t>unauthorised access, use, modification, disclosure or other misuse in accordance</w:t>
+        <w:t>unauthorised</w:t>
+      </w:r>
+      <w:proofErr w:type="spellEnd"/>
+      <w:r>
+        <w:rPr>
+          <w:rFonts w:ascii="Arial" w:hAnsi="Arial" w:cs="Arial"/>
+          <w:sz w:val="20"/>
+          <w:szCs w:val="20"/>
+          <w:lang w:eastAsia="zh-CN"/>
+        </w:rPr>
+        <w:t xml:space="preserve"> access, use, modification, disclosure or other misuse in accordance</w:t>
       </w:r>
       <w:r>
         <w:rPr>
@@ -15342,7 +15833,27 @@
           <w:szCs w:val="20"/>
           <w:lang w:eastAsia="zh-CN"/>
         </w:rPr>
-        <w:t>the Gebiz Specification Form (GSF)</w:t>
+        <w:t xml:space="preserve">the </w:t>
+      </w:r>
+      <w:proofErr w:type="spellStart"/>
+      <w:r>
+        <w:rPr>
+          <w:rFonts w:ascii="Arial" w:hAnsi="Arial" w:cs="Arial"/>
+          <w:sz w:val="20"/>
+          <w:szCs w:val="20"/>
+          <w:lang w:eastAsia="zh-CN"/>
+        </w:rPr>
+        <w:t>Gebiz</w:t>
+      </w:r>
+      <w:proofErr w:type="spellEnd"/>
+      <w:r>
+        <w:rPr>
+          <w:rFonts w:ascii="Arial" w:hAnsi="Arial" w:cs="Arial"/>
+          <w:sz w:val="20"/>
+          <w:szCs w:val="20"/>
+          <w:lang w:eastAsia="zh-CN"/>
+        </w:rPr>
+        <w:t xml:space="preserve"> Specification Form (GSF)</w:t>
       </w:r>
       <w:r>
         <w:rPr>
@@ -15351,7 +15862,27 @@
           <w:szCs w:val="20"/>
           <w:lang w:eastAsia="zh-CN"/>
         </w:rPr>
-        <w:t xml:space="preserve"> , and that only authorised personnel</w:t>
+        <w:t xml:space="preserve"> , and that only </w:t>
+      </w:r>
+      <w:proofErr w:type="spellStart"/>
+      <w:r>
+        <w:rPr>
+          <w:rFonts w:ascii="Arial" w:hAnsi="Arial" w:cs="Arial"/>
+          <w:sz w:val="20"/>
+          <w:szCs w:val="20"/>
+          <w:lang w:eastAsia="zh-CN"/>
+        </w:rPr>
+        <w:t>authorised</w:t>
+      </w:r>
+      <w:proofErr w:type="spellEnd"/>
+      <w:r>
+        <w:rPr>
+          <w:rFonts w:ascii="Arial" w:hAnsi="Arial" w:cs="Arial"/>
+          <w:sz w:val="20"/>
+          <w:szCs w:val="20"/>
+          <w:lang w:eastAsia="zh-CN"/>
+        </w:rPr>
+        <w:t xml:space="preserve"> personnel</w:t>
       </w:r>
       <w:r>
         <w:rPr>
@@ -16252,6 +16783,7 @@
         </w:rPr>
         <w:t xml:space="preserve"> </w:t>
       </w:r>
+      <w:proofErr w:type="spellStart"/>
       <w:r>
         <w:rPr>
           <w:rFonts w:ascii="Arial" w:hAnsi="Arial" w:cs="Arial"/>
@@ -16259,7 +16791,17 @@
           <w:szCs w:val="20"/>
           <w:lang w:eastAsia="zh-CN"/>
         </w:rPr>
-        <w:t>unauthorised use or disclosure of that data.</w:t>
+        <w:t>unauthorised</w:t>
+      </w:r>
+      <w:proofErr w:type="spellEnd"/>
+      <w:r>
+        <w:rPr>
+          <w:rFonts w:ascii="Arial" w:hAnsi="Arial" w:cs="Arial"/>
+          <w:sz w:val="20"/>
+          <w:szCs w:val="20"/>
+          <w:lang w:eastAsia="zh-CN"/>
+        </w:rPr>
+        <w:t xml:space="preserve"> use or disclosure of that data.</w:t>
       </w:r>
     </w:p>
     <w:p>
@@ -16299,7 +16841,6 @@
           <w:szCs w:val="20"/>
           <w:lang w:eastAsia="zh-CN"/>
         </w:rPr>
-        <w:lastRenderedPageBreak/>
         <w:t>5. Employee awareness of data protection requirements and undertakings</w:t>
       </w:r>
     </w:p>
@@ -16691,7 +17232,27 @@
           <w:szCs w:val="20"/>
           <w:lang w:eastAsia="zh-CN"/>
         </w:rPr>
-        <w:t>contractual provisions relating to security, unauthorised disclosure and</w:t>
+        <w:t xml:space="preserve">contractual provisions relating to security, </w:t>
+      </w:r>
+      <w:proofErr w:type="spellStart"/>
+      <w:r>
+        <w:rPr>
+          <w:rFonts w:ascii="Arial" w:hAnsi="Arial" w:cs="Arial"/>
+          <w:sz w:val="20"/>
+          <w:szCs w:val="20"/>
+          <w:lang w:eastAsia="zh-CN"/>
+        </w:rPr>
+        <w:t>unauthorised</w:t>
+      </w:r>
+      <w:proofErr w:type="spellEnd"/>
+      <w:r>
+        <w:rPr>
+          <w:rFonts w:ascii="Arial" w:hAnsi="Arial" w:cs="Arial"/>
+          <w:sz w:val="20"/>
+          <w:szCs w:val="20"/>
+          <w:lang w:eastAsia="zh-CN"/>
+        </w:rPr>
+        <w:t xml:space="preserve"> disclosure and</w:t>
       </w:r>
       <w:r>
         <w:rPr>
@@ -16702,6 +17263,7 @@
         </w:rPr>
         <w:t xml:space="preserve"> </w:t>
       </w:r>
+      <w:proofErr w:type="spellStart"/>
       <w:r>
         <w:rPr>
           <w:rFonts w:ascii="Arial" w:hAnsi="Arial" w:cs="Arial"/>
@@ -16709,7 +17271,17 @@
           <w:szCs w:val="20"/>
           <w:lang w:eastAsia="zh-CN"/>
         </w:rPr>
-        <w:t>unauthorised use, and also where an employee has had access to personal</w:t>
+        <w:t>unauthorised</w:t>
+      </w:r>
+      <w:proofErr w:type="spellEnd"/>
+      <w:r>
+        <w:rPr>
+          <w:rFonts w:ascii="Arial" w:hAnsi="Arial" w:cs="Arial"/>
+          <w:sz w:val="20"/>
+          <w:szCs w:val="20"/>
+          <w:lang w:eastAsia="zh-CN"/>
+        </w:rPr>
+        <w:t xml:space="preserve"> use, and also where an employee has had access to personal</w:t>
       </w:r>
       <w:r>
         <w:rPr>

</xml_diff>

<commit_message>
Applied works and filled in compliance details
</commit_message>
<xml_diff>
--- a/01-planning/00-tender-review/01 - original/FY26-FMS-003x-ITQ GSF Cloud-Based Resource Booking System.docx
+++ b/01-planning/00-tender-review/01 - original/FY26-FMS-003x-ITQ GSF Cloud-Based Resource Booking System.docx
@@ -9539,6 +9539,49 @@
                 <w:szCs w:val="20"/>
               </w:rPr>
             </w:pPr>
+            <w:r>
+              <w:rPr>
+                <w:rFonts w:asciiTheme="minorHAnsi" w:hAnsiTheme="minorHAnsi" w:cstheme="minorHAnsi"/>
+                <w:sz w:val="20"/>
+                <w:szCs w:val="20"/>
+              </w:rPr>
+              <w:t xml:space="preserve">The proposed system is to perform a CSV creation of users. Each of the users in the email list will receive an invitation link, for the user to sign in. </w:t>
+            </w:r>
+          </w:p>
+          <w:p>
+            <w:pPr>
+              <w:rPr>
+                <w:rFonts w:asciiTheme="minorHAnsi" w:hAnsiTheme="minorHAnsi" w:cstheme="minorHAnsi"/>
+                <w:sz w:val="20"/>
+                <w:szCs w:val="20"/>
+              </w:rPr>
+            </w:pPr>
+          </w:p>
+          <w:p>
+            <w:pPr>
+              <w:rPr>
+                <w:rFonts w:asciiTheme="minorHAnsi" w:hAnsiTheme="minorHAnsi" w:cstheme="minorHAnsi"/>
+                <w:sz w:val="20"/>
+                <w:szCs w:val="20"/>
+              </w:rPr>
+            </w:pPr>
+            <w:r>
+              <w:rPr>
+                <w:rFonts w:asciiTheme="minorHAnsi" w:hAnsiTheme="minorHAnsi" w:cstheme="minorHAnsi"/>
+                <w:sz w:val="20"/>
+                <w:szCs w:val="20"/>
+              </w:rPr>
+              <w:t xml:space="preserve">Upon doing so, these new users will be prompted to reset their password. </w:t>
+            </w:r>
+          </w:p>
+          <w:p>
+            <w:pPr>
+              <w:rPr>
+                <w:rFonts w:asciiTheme="minorHAnsi" w:hAnsiTheme="minorHAnsi" w:cstheme="minorHAnsi"/>
+                <w:sz w:val="20"/>
+                <w:szCs w:val="20"/>
+              </w:rPr>
+            </w:pPr>
           </w:p>
         </w:tc>
       </w:tr>
@@ -9881,6 +9924,7 @@
                 <w:sz w:val="20"/>
                 <w:szCs w:val="20"/>
               </w:rPr>
+              <w:lastRenderedPageBreak/>
               <w:t>10.2</w:t>
             </w:r>
           </w:p>
@@ -10175,7 +10219,6 @@
                 <w:sz w:val="20"/>
                 <w:szCs w:val="20"/>
               </w:rPr>
-              <w:lastRenderedPageBreak/>
               <w:t>10.3</w:t>
             </w:r>
           </w:p>
@@ -10963,6 +11006,7 @@
                 <w:sz w:val="20"/>
                 <w:szCs w:val="20"/>
               </w:rPr>
+              <w:lastRenderedPageBreak/>
               <w:t>11.2</w:t>
             </w:r>
           </w:p>
@@ -11228,7 +11272,6 @@
                 <w:sz w:val="20"/>
                 <w:szCs w:val="20"/>
               </w:rPr>
-              <w:lastRenderedPageBreak/>
               <w:t>11.3</w:t>
             </w:r>
           </w:p>
@@ -12235,6 +12278,7 @@
                 <w:sz w:val="20"/>
                 <w:szCs w:val="20"/>
               </w:rPr>
+              <w:lastRenderedPageBreak/>
               <w:t>13.1</w:t>
             </w:r>
           </w:p>
@@ -12522,7 +12566,6 @@
                 <w:sz w:val="20"/>
                 <w:szCs w:val="20"/>
               </w:rPr>
-              <w:lastRenderedPageBreak/>
               <w:t>13.</w:t>
             </w:r>
             <w:r>
@@ -13596,6 +13639,7 @@
                 <w:sz w:val="20"/>
                 <w:szCs w:val="20"/>
               </w:rPr>
+              <w:lastRenderedPageBreak/>
               <w:t>14.1</w:t>
             </w:r>
           </w:p>
@@ -13935,7 +13979,6 @@
                 <w:sz w:val="20"/>
                 <w:szCs w:val="20"/>
               </w:rPr>
-              <w:lastRenderedPageBreak/>
               <w:t>14.2</w:t>
             </w:r>
           </w:p>
@@ -26125,6 +26168,10 @@
 </file>
 
 <file path=customXml/item1.xml><?xml version="1.0" encoding="utf-8"?>
+<LongProperties xmlns="http://schemas.microsoft.com/office/2006/metadata/longProperties"/>
+</file>
+
+<file path=customXml/item2.xml><?xml version="1.0" encoding="utf-8"?>
 <ct:contentTypeSchema xmlns:ct="http://schemas.microsoft.com/office/2006/metadata/contentType" xmlns:ma="http://schemas.microsoft.com/office/2006/metadata/properties/metaAttributes" ct:_="" ma:_="" ma:contentTypeName="Document" ma:contentTypeID="0x0101004296E6D26988754C88FA1CC70F2E4151" ma:contentTypeVersion="28" ma:contentTypeDescription="Create a new document." ma:contentTypeScope="" ma:versionID="4eef678adc2d1f3f1a34fd8e1fb43d85">
   <xsd:schema xmlns:xsd="http://www.w3.org/2001/XMLSchema" xmlns:xs="http://www.w3.org/2001/XMLSchema" xmlns:p="http://schemas.microsoft.com/office/2006/metadata/properties" xmlns:ns2="ecbe173a-6a9f-4166-84d1-f447c63d01bd" xmlns:ns3="6593fbaf-5ff3-4e50-8e3b-ceec717dc114" targetNamespace="http://schemas.microsoft.com/office/2006/metadata/properties" ma:root="true" ma:fieldsID="e3dae5c12d48ee67eee6ad5a6f2b9b5b" ns2:_="" ns3:_="">
     <xsd:import namespace="ecbe173a-6a9f-4166-84d1-f447c63d01bd"/>
@@ -26301,17 +26348,8 @@
 </ct:contentTypeSchema>
 </file>
 
-<file path=customXml/item2.xml><?xml version="1.0" encoding="utf-8"?>
-<LongProperties xmlns="http://schemas.microsoft.com/office/2006/metadata/longProperties"/>
-</file>
-
 <file path=customXml/item3.xml><?xml version="1.0" encoding="utf-8"?>
-<p:properties xmlns:p="http://schemas.microsoft.com/office/2006/metadata/properties" xmlns:xsi="http://www.w3.org/2001/XMLSchema-instance" xmlns:pc="http://schemas.microsoft.com/office/infopath/2007/PartnerControls">
-  <documentManagement>
-    <Section xmlns="ecbe173a-6a9f-4166-84d1-f447c63d01bd">Purchasing</Section>
-    <Category xmlns="ecbe173a-6a9f-4166-84d1-f447c63d01bd">ITQ / PERIOD CONTRACT BUY</Category>
-  </documentManagement>
-</p:properties>
+<b:Sources xmlns:b="http://schemas.openxmlformats.org/officeDocument/2006/bibliography" xmlns="http://schemas.openxmlformats.org/officeDocument/2006/bibliography" SelectedStyle="\APA.XSL" StyleName="APA"/>
 </file>
 
 <file path=customXml/item4.xml><?xml version="1.0" encoding="utf-8"?>
@@ -26324,10 +26362,23 @@
 </file>
 
 <file path=customXml/item5.xml><?xml version="1.0" encoding="utf-8"?>
-<b:Sources xmlns:b="http://schemas.openxmlformats.org/officeDocument/2006/bibliography" xmlns="http://schemas.openxmlformats.org/officeDocument/2006/bibliography" SelectedStyle="\APA.XSL" StyleName="APA"/>
+<p:properties xmlns:p="http://schemas.microsoft.com/office/2006/metadata/properties" xmlns:xsi="http://www.w3.org/2001/XMLSchema-instance" xmlns:pc="http://schemas.microsoft.com/office/infopath/2007/PartnerControls">
+  <documentManagement>
+    <Section xmlns="ecbe173a-6a9f-4166-84d1-f447c63d01bd">Purchasing</Section>
+    <Category xmlns="ecbe173a-6a9f-4166-84d1-f447c63d01bd">ITQ / PERIOD CONTRACT BUY</Category>
+  </documentManagement>
+</p:properties>
 </file>
 
 <file path=customXml/itemProps1.xml><?xml version="1.0" encoding="utf-8"?>
+<ds:datastoreItem xmlns:ds="http://schemas.openxmlformats.org/officeDocument/2006/customXml" ds:itemID="{102ACD38-4117-4992-BE67-8D0333073DA5}">
+  <ds:schemaRefs>
+    <ds:schemaRef ds:uri="http://schemas.microsoft.com/office/2006/metadata/longProperties"/>
+  </ds:schemaRefs>
+</ds:datastoreItem>
+</file>
+
+<file path=customXml/itemProps2.xml><?xml version="1.0" encoding="utf-8"?>
 <ds:datastoreItem xmlns:ds="http://schemas.openxmlformats.org/officeDocument/2006/customXml" ds:itemID="{D3BBFFE3-7F66-451A-A021-DC52BFD6DE09}">
   <ds:schemaRefs>
     <ds:schemaRef ds:uri="http://schemas.microsoft.com/office/2006/metadata/contentType"/>
@@ -26346,20 +26397,10 @@
 </ds:datastoreItem>
 </file>
 
-<file path=customXml/itemProps2.xml><?xml version="1.0" encoding="utf-8"?>
-<ds:datastoreItem xmlns:ds="http://schemas.openxmlformats.org/officeDocument/2006/customXml" ds:itemID="{102ACD38-4117-4992-BE67-8D0333073DA5}">
+<file path=customXml/itemProps3.xml><?xml version="1.0" encoding="utf-8"?>
+<ds:datastoreItem xmlns:ds="http://schemas.openxmlformats.org/officeDocument/2006/customXml" ds:itemID="{CC4BD3C0-1931-4393-80C4-531669E310D8}">
   <ds:schemaRefs>
-    <ds:schemaRef ds:uri="http://schemas.microsoft.com/office/2006/metadata/longProperties"/>
-  </ds:schemaRefs>
-</ds:datastoreItem>
-</file>
-
-<file path=customXml/itemProps3.xml><?xml version="1.0" encoding="utf-8"?>
-<ds:datastoreItem xmlns:ds="http://schemas.openxmlformats.org/officeDocument/2006/customXml" ds:itemID="{99E05C55-4735-4C06-92B5-95113743A3BF}">
-  <ds:schemaRefs>
-    <ds:schemaRef ds:uri="http://schemas.microsoft.com/office/2006/metadata/properties"/>
-    <ds:schemaRef ds:uri="http://schemas.microsoft.com/office/infopath/2007/PartnerControls"/>
-    <ds:schemaRef ds:uri="ecbe173a-6a9f-4166-84d1-f447c63d01bd"/>
+    <ds:schemaRef ds:uri="http://schemas.openxmlformats.org/officeDocument/2006/bibliography"/>
   </ds:schemaRefs>
 </ds:datastoreItem>
 </file>
@@ -26373,9 +26414,11 @@
 </file>
 
 <file path=customXml/itemProps5.xml><?xml version="1.0" encoding="utf-8"?>
-<ds:datastoreItem xmlns:ds="http://schemas.openxmlformats.org/officeDocument/2006/customXml" ds:itemID="{CC4BD3C0-1931-4393-80C4-531669E310D8}">
+<ds:datastoreItem xmlns:ds="http://schemas.openxmlformats.org/officeDocument/2006/customXml" ds:itemID="{99E05C55-4735-4C06-92B5-95113743A3BF}">
   <ds:schemaRefs>
-    <ds:schemaRef ds:uri="http://schemas.openxmlformats.org/officeDocument/2006/bibliography"/>
+    <ds:schemaRef ds:uri="http://schemas.microsoft.com/office/2006/metadata/properties"/>
+    <ds:schemaRef ds:uri="http://schemas.microsoft.com/office/infopath/2007/PartnerControls"/>
+    <ds:schemaRef ds:uri="ecbe173a-6a9f-4166-84d1-f447c63d01bd"/>
   </ds:schemaRefs>
 </ds:datastoreItem>
 </file>
</xml_diff>